<commit_message>
docs: integrate authentic Newus Technology team structure, founder profile, and user student data into Laporan PKL
</commit_message>
<xml_diff>
--- a/docs/Laporan_PKL_FTIK_Teknokrat_LMS_2026.docx
+++ b/docs/Laporan_PKL_FTIK_Teknokrat_LMS_2026.docx
@@ -129,7 +129,7 @@
           <w:sz w:val="24"/>
           <w:u w:val="none"/>
         </w:rPr>
-        <w:t>2. FATHUR RAMANTHA (23312087)</w:t>
+        <w:t>2. FATHUR RAMANTHA (23312105)</w:t>
       </w:r>
     </w:p>
     <w:p>
@@ -145,7 +145,7 @@
           <w:sz w:val="24"/>
           <w:u w:val="none"/>
         </w:rPr>
-        <w:t>3. I PUTU PANDU (23312088)</w:t>
+        <w:t>3. I PUTU PANDU WIRANATA (23312088)</w:t>
       </w:r>
     </w:p>
     <w:p>
@@ -363,7 +363,7 @@
           <w:u w:val="none"/>
         </w:rPr>
         <w:tab/>
-        <w:t>2.  Fathur Ramantha (23312087)</w:t>
+        <w:t>2.  Fathur Ramantha (23312105)</w:t>
       </w:r>
     </w:p>
     <w:p>
@@ -380,7 +380,7 @@
           <w:u w:val="none"/>
         </w:rPr>
         <w:tab/>
-        <w:t>3.  I Putu Pandu (23312088)</w:t>
+        <w:t>3.  I Putu Pandu Wiranata (23312088)</w:t>
       </w:r>
     </w:p>
     <w:p>
@@ -977,7 +977,7 @@
           <w:sz w:val="24"/>
           <w:u w:val="none"/>
         </w:rPr>
-        <w:t>2.   FATHUR RAMANTHA  (23312087)</w:t>
+        <w:t>2.   FATHUR RAMANTHA  (23312105)</w:t>
       </w:r>
     </w:p>
     <w:p>
@@ -993,7 +993,7 @@
           <w:sz w:val="24"/>
           <w:u w:val="none"/>
         </w:rPr>
-        <w:t>3.   I PUTU PANDU  (23312088)</w:t>
+        <w:t>3.   I PUTU PANDU WIRANATA  (23312088)</w:t>
       </w:r>
     </w:p>
     <w:p>
@@ -1704,7 +1704,7 @@
           <w:sz w:val="24"/>
           <w:u w:val="none"/>
         </w:rPr>
-        <w:t>7) Pihak CV Newus Teknologi Bandar Lampung yang telah banyak membantu dan memberikan bimbingan selama melaksanakan PKL serta membantu dalam usaha memperoleh data yang penulis perlukan.</w:t>
+        <w:t>7) Ir. Antoni, S.T., IPM selaku Founder &amp; CEO CV Newus Teknologi beserta seluruh tim profesional yang telah banyak membantu, membimbing, dan memberikan kesempatan berharga selama melaksanakan PKL.</w:t>
       </w:r>
     </w:p>
     <w:p>
@@ -1720,7 +1720,7 @@
           <w:sz w:val="24"/>
           <w:u w:val="none"/>
         </w:rPr>
-        <w:t>8) Orang tua dan keluarga yang telah memberikan doa, motivasi, dan dukungan moral maupun materiil.</w:t>
+        <w:t>8) Orang tua dan keluarga tercinta yang senantiasa memberikan doa, motivasi, dan dukungan moral maupun materiil.</w:t>
       </w:r>
     </w:p>
     <w:p>
@@ -1736,7 +1736,7 @@
           <w:sz w:val="24"/>
           <w:u w:val="none"/>
         </w:rPr>
-        <w:t>9) Seluruh rekan mahasiswa S1 Informatika Universitas Teknokrat Indonesia.</w:t>
+        <w:t>9) Seluruh rekan mahasiswa Program Studi S1 Informatika Fakultas Teknik dan Ilmu Komputer Universitas Teknokrat Indonesia.</w:t>
       </w:r>
     </w:p>
     <w:p>
@@ -1753,7 +1753,7 @@
           <w:sz w:val="24"/>
           <w:u w:val="none"/>
         </w:rPr>
-        <w:t>Akhir kata, penulis berharap semoga Allah SWT berkenan membalas segala kebaikan semua pihak yang telah membantu dan semoga Laporan PKL ini membawa manfaat.</w:t>
+        <w:t>Akhir kata, penulis berharap semoga Allah SWT berkenan membalas segala kebaikan semua pihak yang telah membantu dan semoga Laporan PKL ini membawa manfaat bagi pengembangan ilmu pengetahuan dan teknologi.</w:t>
       </w:r>
     </w:p>
     <w:p>
@@ -2354,7 +2354,7 @@
           <w:sz w:val="24"/>
           <w:u w:val="none"/>
         </w:rPr>
-        <w:t xml:space="preserve">  ...............................  12</w:t>
+        <w:t xml:space="preserve">  ...............................  13</w:t>
       </w:r>
     </w:p>
     <w:p>
@@ -2380,7 +2380,7 @@
           <w:sz w:val="24"/>
           <w:u w:val="none"/>
         </w:rPr>
-        <w:t xml:space="preserve">  ..................  14</w:t>
+        <w:t xml:space="preserve">  ..................  15</w:t>
       </w:r>
     </w:p>
     <w:p>
@@ -2407,7 +2407,7 @@
           <w:sz w:val="24"/>
           <w:u w:val="none"/>
         </w:rPr>
-        <w:t xml:space="preserve">  .......................................  14</w:t>
+        <w:t xml:space="preserve">  .......................................  15</w:t>
       </w:r>
     </w:p>
     <w:p>
@@ -2434,7 +2434,7 @@
           <w:sz w:val="24"/>
           <w:u w:val="none"/>
         </w:rPr>
-        <w:t xml:space="preserve">  .......................................  14</w:t>
+        <w:t xml:space="preserve">  .......................................  15</w:t>
       </w:r>
     </w:p>
     <w:p>
@@ -2461,7 +2461,7 @@
           <w:sz w:val="24"/>
           <w:u w:val="none"/>
         </w:rPr>
-        <w:t xml:space="preserve">  ..................................  15</w:t>
+        <w:t xml:space="preserve">  ..................................  16</w:t>
       </w:r>
     </w:p>
     <w:p>
@@ -2488,7 +2488,7 @@
           <w:sz w:val="24"/>
           <w:u w:val="none"/>
         </w:rPr>
-        <w:t xml:space="preserve">  ..............................  24</w:t>
+        <w:t xml:space="preserve">  ..............................  25</w:t>
       </w:r>
     </w:p>
     <w:p>
@@ -2515,7 +2515,7 @@
           <w:sz w:val="24"/>
           <w:u w:val="none"/>
         </w:rPr>
-        <w:t xml:space="preserve">  .............................  25</w:t>
+        <w:t xml:space="preserve">  .............................  26</w:t>
       </w:r>
     </w:p>
     <w:p>
@@ -2542,7 +2542,7 @@
           <w:sz w:val="24"/>
           <w:u w:val="none"/>
         </w:rPr>
-        <w:t xml:space="preserve">  ........................................  28</w:t>
+        <w:t xml:space="preserve">  ........................................  29</w:t>
       </w:r>
     </w:p>
     <w:p>
@@ -2569,7 +2569,7 @@
           <w:sz w:val="24"/>
           <w:u w:val="none"/>
         </w:rPr>
-        <w:t xml:space="preserve">  .......................................  28</w:t>
+        <w:t xml:space="preserve">  .......................................  29</w:t>
       </w:r>
     </w:p>
     <w:p>
@@ -2596,7 +2596,7 @@
           <w:sz w:val="24"/>
           <w:u w:val="none"/>
         </w:rPr>
-        <w:t xml:space="preserve">  ..................................  29</w:t>
+        <w:t xml:space="preserve">  ..................................  30</w:t>
       </w:r>
     </w:p>
     <w:p>
@@ -2623,7 +2623,7 @@
           <w:sz w:val="24"/>
           <w:u w:val="none"/>
         </w:rPr>
-        <w:t xml:space="preserve">  ..............................  36</w:t>
+        <w:t xml:space="preserve">  ..............................  37</w:t>
       </w:r>
     </w:p>
     <w:p>
@@ -2650,7 +2650,7 @@
           <w:sz w:val="24"/>
           <w:u w:val="none"/>
         </w:rPr>
-        <w:t xml:space="preserve">  .............................  37</w:t>
+        <w:t xml:space="preserve">  .............................  38</w:t>
       </w:r>
     </w:p>
     <w:p>
@@ -2667,17 +2667,17 @@
           <w:sz w:val="24"/>
           <w:u w:val="none"/>
         </w:rPr>
-        <w:t>3.3 I PUTU PANDU</w:t>
-      </w:r>
-      <w:r>
-        <w:rPr>
-          <w:rFonts w:ascii="Times New Roman" w:hAnsi="Times New Roman"/>
-          <w:b w:val="0"/>
-          <w:i w:val="0"/>
-          <w:sz w:val="24"/>
-          <w:u w:val="none"/>
-        </w:rPr>
-        <w:t xml:space="preserve">  ...........................................  40</w:t>
+        <w:t>3.3 I PUTU PANDU WIRANATA</w:t>
+      </w:r>
+      <w:r>
+        <w:rPr>
+          <w:rFonts w:ascii="Times New Roman" w:hAnsi="Times New Roman"/>
+          <w:b w:val="0"/>
+          <w:i w:val="0"/>
+          <w:sz w:val="24"/>
+          <w:u w:val="none"/>
+        </w:rPr>
+        <w:t xml:space="preserve">  ..................................  41</w:t>
       </w:r>
     </w:p>
     <w:p>
@@ -2704,7 +2704,7 @@
           <w:sz w:val="24"/>
           <w:u w:val="none"/>
         </w:rPr>
-        <w:t xml:space="preserve">  .......................................  40</w:t>
+        <w:t xml:space="preserve">  .......................................  41</w:t>
       </w:r>
     </w:p>
     <w:p>
@@ -2731,7 +2731,7 @@
           <w:sz w:val="24"/>
           <w:u w:val="none"/>
         </w:rPr>
-        <w:t xml:space="preserve">  ..................................  41</w:t>
+        <w:t xml:space="preserve">  ..................................  42</w:t>
       </w:r>
     </w:p>
     <w:p>
@@ -2758,7 +2758,7 @@
           <w:sz w:val="24"/>
           <w:u w:val="none"/>
         </w:rPr>
-        <w:t xml:space="preserve">  ..............................  48</w:t>
+        <w:t xml:space="preserve">  ..............................  49</w:t>
       </w:r>
     </w:p>
     <w:p>
@@ -2785,7 +2785,7 @@
           <w:sz w:val="24"/>
           <w:u w:val="none"/>
         </w:rPr>
-        <w:t xml:space="preserve">  .............................  49</w:t>
+        <w:t xml:space="preserve">  .............................  50</w:t>
       </w:r>
     </w:p>
     <w:p>
@@ -2811,7 +2811,7 @@
           <w:sz w:val="24"/>
           <w:u w:val="none"/>
         </w:rPr>
-        <w:t xml:space="preserve">  ..............................................  52</w:t>
+        <w:t xml:space="preserve">  ..............................................  53</w:t>
       </w:r>
     </w:p>
     <w:p>
@@ -2838,7 +2838,7 @@
           <w:sz w:val="24"/>
           <w:u w:val="none"/>
         </w:rPr>
-        <w:t xml:space="preserve">  ...............................................  52</w:t>
+        <w:t xml:space="preserve">  ...............................................  53</w:t>
       </w:r>
     </w:p>
     <w:p>
@@ -2865,7 +2865,7 @@
           <w:sz w:val="24"/>
           <w:u w:val="none"/>
         </w:rPr>
-        <w:t xml:space="preserve">  ..................................................  54</w:t>
+        <w:t xml:space="preserve">  ..................................................  55</w:t>
       </w:r>
     </w:p>
     <w:p>
@@ -2891,7 +2891,7 @@
           <w:sz w:val="24"/>
           <w:u w:val="none"/>
         </w:rPr>
-        <w:t xml:space="preserve">  ..............................................  56</w:t>
+        <w:t xml:space="preserve">  ..............................................  57</w:t>
       </w:r>
     </w:p>
     <w:p>
@@ -2917,7 +2917,7 @@
           <w:sz w:val="24"/>
           <w:u w:val="none"/>
         </w:rPr>
-        <w:t xml:space="preserve">  ....................................................  57</w:t>
+        <w:t xml:space="preserve">  ....................................................  58</w:t>
       </w:r>
     </w:p>
     <w:p>
@@ -2996,17 +2996,17 @@
           <w:sz w:val="24"/>
           <w:u w:val="none"/>
         </w:rPr>
-        <w:t>Tabel 3.1 Daftar Endpoint RESTful API Laravel 11</w:t>
-      </w:r>
-      <w:r>
-        <w:rPr>
-          <w:rFonts w:ascii="Times New Roman" w:hAnsi="Times New Roman"/>
-          <w:b w:val="0"/>
-          <w:i w:val="0"/>
-          <w:sz w:val="24"/>
-          <w:u w:val="none"/>
-        </w:rPr>
-        <w:t xml:space="preserve">  ..............  18</w:t>
+        <w:t>Tabel 2.1 Daftar Susunan Tim Inti CV Newus Teknologi</w:t>
+      </w:r>
+      <w:r>
+        <w:rPr>
+          <w:rFonts w:ascii="Times New Roman" w:hAnsi="Times New Roman"/>
+          <w:b w:val="0"/>
+          <w:i w:val="0"/>
+          <w:sz w:val="24"/>
+          <w:u w:val="none"/>
+        </w:rPr>
+        <w:t xml:space="preserve">  ..........  12</w:t>
       </w:r>
     </w:p>
     <w:p>
@@ -3022,17 +3022,17 @@
           <w:sz w:val="24"/>
           <w:u w:val="none"/>
         </w:rPr>
-        <w:t>Tabel 3.2 Struktur Tabel Basis Data MySQL</w:t>
-      </w:r>
-      <w:r>
-        <w:rPr>
-          <w:rFonts w:ascii="Times New Roman" w:hAnsi="Times New Roman"/>
-          <w:b w:val="0"/>
-          <w:i w:val="0"/>
-          <w:sz w:val="24"/>
-          <w:u w:val="none"/>
-        </w:rPr>
-        <w:t xml:space="preserve">  .....................  16</w:t>
+        <w:t>Tabel 3.1 Daftar Endpoint RESTful API Laravel 11</w:t>
+      </w:r>
+      <w:r>
+        <w:rPr>
+          <w:rFonts w:ascii="Times New Roman" w:hAnsi="Times New Roman"/>
+          <w:b w:val="0"/>
+          <w:i w:val="0"/>
+          <w:sz w:val="24"/>
+          <w:u w:val="none"/>
+        </w:rPr>
+        <w:t xml:space="preserve">  ..............  19</w:t>
       </w:r>
     </w:p>
     <w:p>
@@ -3048,17 +3048,17 @@
           <w:sz w:val="24"/>
           <w:u w:val="none"/>
         </w:rPr>
-        <w:t>Tabel 3.3 Daftar Komponen Antarmuka Next.js</w:t>
-      </w:r>
-      <w:r>
-        <w:rPr>
-          <w:rFonts w:ascii="Times New Roman" w:hAnsi="Times New Roman"/>
-          <w:b w:val="0"/>
-          <w:i w:val="0"/>
-          <w:sz w:val="24"/>
-          <w:u w:val="none"/>
-        </w:rPr>
-        <w:t xml:space="preserve">  ...................  31</w:t>
+        <w:t>Tabel 3.2 Struktur Tabel Basis Data MySQL</w:t>
+      </w:r>
+      <w:r>
+        <w:rPr>
+          <w:rFonts w:ascii="Times New Roman" w:hAnsi="Times New Roman"/>
+          <w:b w:val="0"/>
+          <w:i w:val="0"/>
+          <w:sz w:val="24"/>
+          <w:u w:val="none"/>
+        </w:rPr>
+        <w:t xml:space="preserve">  .....................  17</w:t>
       </w:r>
     </w:p>
     <w:p>
@@ -3074,6 +3074,32 @@
           <w:sz w:val="24"/>
           <w:u w:val="none"/>
         </w:rPr>
+        <w:t>Tabel 3.3 Daftar Komponen Antarmuka Next.js</w:t>
+      </w:r>
+      <w:r>
+        <w:rPr>
+          <w:rFonts w:ascii="Times New Roman" w:hAnsi="Times New Roman"/>
+          <w:b w:val="0"/>
+          <w:i w:val="0"/>
+          <w:sz w:val="24"/>
+          <w:u w:val="none"/>
+        </w:rPr>
+        <w:t xml:space="preserve">  ...................  32</w:t>
+      </w:r>
+    </w:p>
+    <w:p>
+      <w:pPr>
+        <w:spacing w:before="0" w:after="0" w:line="360" w:lineRule="auto"/>
+        <w:jc w:val="left"/>
+      </w:pPr>
+      <w:r>
+        <w:rPr>
+          <w:rFonts w:ascii="Times New Roman" w:hAnsi="Times New Roman"/>
+          <w:b w:val="0"/>
+          <w:i w:val="0"/>
+          <w:sz w:val="24"/>
+          <w:u w:val="none"/>
+        </w:rPr>
         <w:t>Tabel 3.4 Hasil Pengujian Otomatis (E2E Automated Bot Testing)</w:t>
       </w:r>
       <w:r>
@@ -3084,7 +3110,7 @@
           <w:sz w:val="24"/>
           <w:u w:val="none"/>
         </w:rPr>
-        <w:t xml:space="preserve">  ...  46</w:t>
+        <w:t xml:space="preserve">  ...  47</w:t>
       </w:r>
     </w:p>
     <w:p>
@@ -3199,7 +3225,7 @@
           <w:sz w:val="24"/>
           <w:u w:val="none"/>
         </w:rPr>
-        <w:t xml:space="preserve">  .............  11</w:t>
+        <w:t xml:space="preserve">  .............  12</w:t>
       </w:r>
     </w:p>
     <w:p>
@@ -3225,7 +3251,7 @@
           <w:sz w:val="24"/>
           <w:u w:val="none"/>
         </w:rPr>
-        <w:t xml:space="preserve">  .......  14</w:t>
+        <w:t xml:space="preserve">  .......  15</w:t>
       </w:r>
     </w:p>
     <w:p>
@@ -3251,7 +3277,7 @@
           <w:sz w:val="24"/>
           <w:u w:val="none"/>
         </w:rPr>
-        <w:t xml:space="preserve">  .......  15</w:t>
+        <w:t xml:space="preserve">  .......  16</w:t>
       </w:r>
     </w:p>
     <w:p>
@@ -3277,7 +3303,7 @@
           <w:sz w:val="24"/>
           <w:u w:val="none"/>
         </w:rPr>
-        <w:t xml:space="preserve">  ................  42</w:t>
+        <w:t xml:space="preserve">  ................  43</w:t>
       </w:r>
     </w:p>
     <w:p>
@@ -3303,7 +3329,7 @@
           <w:sz w:val="24"/>
           <w:u w:val="none"/>
         </w:rPr>
-        <w:t xml:space="preserve">  ............  43</w:t>
+        <w:t xml:space="preserve">  ............  44</w:t>
       </w:r>
     </w:p>
     <w:p>
@@ -3329,7 +3355,7 @@
           <w:sz w:val="24"/>
           <w:u w:val="none"/>
         </w:rPr>
-        <w:t xml:space="preserve">  ..................  20</w:t>
+        <w:t xml:space="preserve">  ..................  21</w:t>
       </w:r>
     </w:p>
     <w:p>
@@ -3355,7 +3381,7 @@
           <w:sz w:val="24"/>
           <w:u w:val="none"/>
         </w:rPr>
-        <w:t xml:space="preserve">  ...................  30</w:t>
+        <w:t xml:space="preserve">  ...................  31</w:t>
       </w:r>
     </w:p>
     <w:p>
@@ -3381,7 +3407,7 @@
           <w:sz w:val="24"/>
           <w:u w:val="none"/>
         </w:rPr>
-        <w:t xml:space="preserve">  ...................  32</w:t>
+        <w:t xml:space="preserve">  ...................  33</w:t>
       </w:r>
     </w:p>
     <w:p>
@@ -3407,7 +3433,7 @@
           <w:sz w:val="24"/>
           <w:u w:val="none"/>
         </w:rPr>
-        <w:t xml:space="preserve">  ...........................  33</w:t>
+        <w:t xml:space="preserve">  ...........................  34</w:t>
       </w:r>
     </w:p>
     <w:p>
@@ -3433,7 +3459,7 @@
           <w:sz w:val="24"/>
           <w:u w:val="none"/>
         </w:rPr>
-        <w:t xml:space="preserve">  ...................  34</w:t>
+        <w:t xml:space="preserve">  ...................  35</w:t>
       </w:r>
     </w:p>
     <w:p>
@@ -3459,7 +3485,7 @@
           <w:sz w:val="24"/>
           <w:u w:val="none"/>
         </w:rPr>
-        <w:t xml:space="preserve">  ...................  35</w:t>
+        <w:t xml:space="preserve">  ...................  36</w:t>
       </w:r>
     </w:p>
     <w:p>
@@ -3485,7 +3511,7 @@
           <w:sz w:val="24"/>
           <w:u w:val="none"/>
         </w:rPr>
-        <w:t xml:space="preserve">  ...................  35</w:t>
+        <w:t xml:space="preserve">  ...................  36</w:t>
       </w:r>
     </w:p>
     <w:p>
@@ -3511,7 +3537,7 @@
           <w:sz w:val="24"/>
           <w:u w:val="none"/>
         </w:rPr>
-        <w:t xml:space="preserve">  .........  44</w:t>
+        <w:t xml:space="preserve">  .........  45</w:t>
       </w:r>
     </w:p>
     <w:p>
@@ -3537,7 +3563,7 @@
           <w:sz w:val="24"/>
           <w:u w:val="none"/>
         </w:rPr>
-        <w:t xml:space="preserve">  .............  44</w:t>
+        <w:t xml:space="preserve">  .............  45</w:t>
       </w:r>
     </w:p>
     <w:p>
@@ -3563,7 +3589,7 @@
           <w:sz w:val="24"/>
           <w:u w:val="none"/>
         </w:rPr>
-        <w:t xml:space="preserve">  ...............  45</w:t>
+        <w:t xml:space="preserve">  ...............  46</w:t>
       </w:r>
     </w:p>
     <w:p>
@@ -3589,7 +3615,7 @@
           <w:sz w:val="24"/>
           <w:u w:val="none"/>
         </w:rPr>
-        <w:t xml:space="preserve">  .......  45</w:t>
+        <w:t xml:space="preserve">  .......  46</w:t>
       </w:r>
     </w:p>
     <w:p>
@@ -3615,7 +3641,7 @@
           <w:sz w:val="24"/>
           <w:u w:val="none"/>
         </w:rPr>
-        <w:t xml:space="preserve">  ..............  46</w:t>
+        <w:t xml:space="preserve">  ..............  47</w:t>
       </w:r>
     </w:p>
     <w:p>
@@ -3641,7 +3667,7 @@
           <w:sz w:val="24"/>
           <w:u w:val="none"/>
         </w:rPr>
-        <w:t xml:space="preserve">  ..........  43</w:t>
+        <w:t xml:space="preserve">  ..........  44</w:t>
       </w:r>
     </w:p>
     <w:p>
@@ -3667,7 +3693,7 @@
           <w:sz w:val="24"/>
           <w:u w:val="none"/>
         </w:rPr>
-        <w:t xml:space="preserve">  ....  47</w:t>
+        <w:t xml:space="preserve">  ....  48</w:t>
       </w:r>
     </w:p>
     <w:p>
@@ -3730,7 +3756,7 @@
           <w:sz w:val="24"/>
           <w:u w:val="none"/>
         </w:rPr>
-        <w:t xml:space="preserve">  ................  57</w:t>
+        <w:t xml:space="preserve">  ................  58</w:t>
       </w:r>
     </w:p>
     <w:p>
@@ -3756,7 +3782,7 @@
           <w:sz w:val="24"/>
           <w:u w:val="none"/>
         </w:rPr>
-        <w:t xml:space="preserve">  ....................  58</w:t>
+        <w:t xml:space="preserve">  ....................  59</w:t>
       </w:r>
     </w:p>
     <w:p>
@@ -3782,7 +3808,7 @@
           <w:sz w:val="24"/>
           <w:u w:val="none"/>
         </w:rPr>
-        <w:t xml:space="preserve">  .................  59</w:t>
+        <w:t xml:space="preserve">  .................  60</w:t>
       </w:r>
     </w:p>
     <w:p>
@@ -3808,7 +3834,7 @@
           <w:sz w:val="24"/>
           <w:u w:val="none"/>
         </w:rPr>
-        <w:t xml:space="preserve">  .....................  60</w:t>
+        <w:t xml:space="preserve">  .....................  61</w:t>
       </w:r>
     </w:p>
     <w:p>
@@ -3824,17 +3850,17 @@
           <w:sz w:val="24"/>
           <w:u w:val="none"/>
         </w:rPr>
-        <w:t>Lampiran 5 Formulir Penilaian I Putu Pandu</w:t>
-      </w:r>
-      <w:r>
-        <w:rPr>
-          <w:rFonts w:ascii="Times New Roman" w:hAnsi="Times New Roman"/>
-          <w:b w:val="0"/>
-          <w:i w:val="0"/>
-          <w:sz w:val="24"/>
-          <w:u w:val="none"/>
-        </w:rPr>
-        <w:t xml:space="preserve">  ....................  61</w:t>
+        <w:t>Lampiran 5 Formulir Penilaian I Putu Pandu Wiranata</w:t>
+      </w:r>
+      <w:r>
+        <w:rPr>
+          <w:rFonts w:ascii="Times New Roman" w:hAnsi="Times New Roman"/>
+          <w:b w:val="0"/>
+          <w:i w:val="0"/>
+          <w:sz w:val="24"/>
+          <w:u w:val="none"/>
+        </w:rPr>
+        <w:t xml:space="preserve">  ...........  62</w:t>
       </w:r>
     </w:p>
     <w:p>
@@ -3850,17 +3876,17 @@
           <w:sz w:val="24"/>
           <w:u w:val="none"/>
         </w:rPr>
-        <w:t>Lampiran 6 Catatan Harian I Putu Pandu</w:t>
-      </w:r>
-      <w:r>
-        <w:rPr>
-          <w:rFonts w:ascii="Times New Roman" w:hAnsi="Times New Roman"/>
-          <w:b w:val="0"/>
-          <w:i w:val="0"/>
-          <w:sz w:val="24"/>
-          <w:u w:val="none"/>
-        </w:rPr>
-        <w:t xml:space="preserve">  ........................  62</w:t>
+        <w:t>Lampiran 6 Catatan Harian I Putu Pandu Wiranata</w:t>
+      </w:r>
+      <w:r>
+        <w:rPr>
+          <w:rFonts w:ascii="Times New Roman" w:hAnsi="Times New Roman"/>
+          <w:b w:val="0"/>
+          <w:i w:val="0"/>
+          <w:sz w:val="24"/>
+          <w:u w:val="none"/>
+        </w:rPr>
+        <w:t xml:space="preserve">  ...............  63</w:t>
       </w:r>
     </w:p>
     <w:p>
@@ -3954,7 +3980,7 @@
           <w:sz w:val="24"/>
           <w:u w:val="none"/>
         </w:rPr>
-        <w:t xml:space="preserve">yang telah diperoleh selama masa perkuliahan di Program Studi S1 Informatika Fakultas Teknik dan Ilmu Komputer Universitas Teknokrat Indonesia. Kegiatan PKL dilaksanakan di CV Newus Teknologi yang berlokasi di Jl. Salim Batubara No.118, Kupang Teba, Kec. Teluk Betung Utara, Kota Bandar Lampung, Lampung selama satu bulan terhitung mulai tanggal 6 Agustus 2026 sampai dengan 6 September 2026. Penulis yang terdiri atas tiga orang mahasiswa (Fery Dwi Ramadhi, Fathur Ramantha, dan I Putu Pandu) ditempatkan pada posisi </w:t>
+        <w:t xml:space="preserve">yang telah diperoleh selama masa perkuliahan di Program Studi S1 Informatika Fakultas Teknik dan Ilmu Komputer Universitas Teknokrat Indonesia. Kegiatan PKL dilaksanakan di CV Newus Teknologi yang berlokasi di Jl. Salim Batubara No.118, Kupang Teba, Kec. Teluk Betung Utara, Kota Bandar Lampung, Lampung selama satu bulan terhitung mulai tanggal 6 Agustus 2026 sampai dengan 6 September 2026. Penulis yang terdiri atas tiga orang mahasiswa (Fery Dwi Ramadhi, Fathur Ramantha, dan I Putu Pandu Wiranata) ditempatkan pada posisi </w:t>
       </w:r>
       <w:r>
         <w:rPr>
@@ -3974,7 +4000,7 @@
           <w:sz w:val="24"/>
           <w:u w:val="none"/>
         </w:rPr>
-        <w:t xml:space="preserve">dengan tanggung jawab merancang dan membangun platform </w:t>
+        <w:t xml:space="preserve">di bawah bimbingan langsung tim profesional Newus Technology dengan tanggung jawab merancang dan membangun platform </w:t>
       </w:r>
       <w:r>
         <w:rPr>
@@ -3994,7 +4020,7 @@
           <w:sz w:val="24"/>
           <w:u w:val="none"/>
         </w:rPr>
-        <w:t>(LMS) berbasis web sesuai dengan kebutuhan spesifikasi perusahaan mitra.</w:t>
+        <w:t>(LMS) berbasis web sesuai dengan kebutuhan spesifikasi industri.</w:t>
       </w:r>
     </w:p>
     <w:p>
@@ -4071,7 +4097,7 @@
           <w:sz w:val="24"/>
           <w:u w:val="none"/>
         </w:rPr>
-        <w:t xml:space="preserve">Next.js dengan Tailwind CSS untuk tiga peran pengguna (Administrator, Guru Pengajar, dan Peserta Didik); serta I Putu Pandu bertanggung jawab atas analisis kebutuhan fungsional (PRD dan diagram UML), manajemen </w:t>
+        <w:t xml:space="preserve">Next.js dengan Tailwind CSS untuk tiga peran pengguna (Administrator, Guru Pengajar, dan Peserta Didik); serta I Putu Pandu Wiranata bertanggung jawab atas analisis kebutuhan fungsional (PRD dan diagram UML), manajemen </w:t>
       </w:r>
       <w:r>
         <w:rPr>
@@ -4450,87 +4476,7 @@
           <w:sz w:val="24"/>
           <w:u w:val="none"/>
         </w:rPr>
-        <w:t xml:space="preserve">CV Newus Teknologi dipilih sebagai tempat pelaksanaan Praktik Kerja Lapangan karena merupakan perusahaan yang bergerak di bidang teknologi informasi dan berfokus pada pengembangan solusi perangkat lunak sesuai kebutuhan klien. Perusahaan ini memiliki lingkungan kerja yang relevan dengan bidang keilmuan Informatika, khususnya dalam pengembangan sistem informasi berbasis web. Selama melaksanakan PKL, penulis ditugaskan untuk merancang dan membangun </w:t>
-      </w:r>
-      <w:r>
-        <w:rPr>
-          <w:rFonts w:ascii="Times New Roman" w:hAnsi="Times New Roman"/>
-          <w:b w:val="0"/>
-          <w:i/>
-          <w:sz w:val="24"/>
-          <w:u w:val="none"/>
-        </w:rPr>
-        <w:t xml:space="preserve">Learning Management System </w:t>
-      </w:r>
-      <w:r>
-        <w:rPr>
-          <w:rFonts w:ascii="Times New Roman" w:hAnsi="Times New Roman"/>
-          <w:b w:val="0"/>
-          <w:i w:val="0"/>
-          <w:sz w:val="24"/>
-          <w:u w:val="none"/>
-        </w:rPr>
-        <w:t xml:space="preserve">(LMS) berbasis web menggunakan </w:t>
-      </w:r>
-      <w:r>
-        <w:rPr>
-          <w:rFonts w:ascii="Times New Roman" w:hAnsi="Times New Roman"/>
-          <w:b w:val="0"/>
-          <w:i/>
-          <w:sz w:val="24"/>
-          <w:u w:val="none"/>
-        </w:rPr>
-        <w:t xml:space="preserve">framework </w:t>
-      </w:r>
-      <w:r>
-        <w:rPr>
-          <w:rFonts w:ascii="Times New Roman" w:hAnsi="Times New Roman"/>
-          <w:b w:val="0"/>
-          <w:i w:val="0"/>
-          <w:sz w:val="24"/>
-          <w:u w:val="none"/>
-        </w:rPr>
-        <w:t xml:space="preserve">Next.js pada sisi </w:t>
-      </w:r>
-      <w:r>
-        <w:rPr>
-          <w:rFonts w:ascii="Times New Roman" w:hAnsi="Times New Roman"/>
-          <w:b w:val="0"/>
-          <w:i/>
-          <w:sz w:val="24"/>
-          <w:u w:val="none"/>
-        </w:rPr>
-        <w:t xml:space="preserve">frontend </w:t>
-      </w:r>
-      <w:r>
-        <w:rPr>
-          <w:rFonts w:ascii="Times New Roman" w:hAnsi="Times New Roman"/>
-          <w:b w:val="0"/>
-          <w:i w:val="0"/>
-          <w:sz w:val="24"/>
-          <w:u w:val="none"/>
-        </w:rPr>
-        <w:t xml:space="preserve">dan Laravel pada sisi </w:t>
-      </w:r>
-      <w:r>
-        <w:rPr>
-          <w:rFonts w:ascii="Times New Roman" w:hAnsi="Times New Roman"/>
-          <w:b w:val="0"/>
-          <w:i/>
-          <w:sz w:val="24"/>
-          <w:u w:val="none"/>
-        </w:rPr>
-        <w:t xml:space="preserve">backend </w:t>
-      </w:r>
-      <w:r>
-        <w:rPr>
-          <w:rFonts w:ascii="Times New Roman" w:hAnsi="Times New Roman"/>
-          <w:b w:val="0"/>
-          <w:i w:val="0"/>
-          <w:sz w:val="24"/>
-          <w:u w:val="none"/>
-        </w:rPr>
-        <w:t>yang terintegrasi dengan basis data MySQL.</w:t>
+        <w:t>CV Newus Teknologi dipilih sebagai tempat pelaksanaan Praktik Kerja Lapangan karena merupakan perusahaan konsultan teknologi informasi dan pengembang perangkat lunak berpengalaman yang berbasis di Bandar Lampung. Perusahaan ini telah berdiri sejak tahun 2021 di bawah kepemimpinan Ir. Antoni, S.T., IPM dan telah menyelesaikan lebih dari 100 solusi teknologi digital untuk sektor pemerintahan, kesehatan, pendidikan, dan korporasi. Lingkungan kerja Newus Technology sangat relevan dengan bidang keilmuan Informatika, khususnya dalam pengembangan sistem informasi berskala besar berbasis arsitektur modern.</w:t>
       </w:r>
     </w:p>
     <w:p>
@@ -4547,6 +4493,103 @@
           <w:sz w:val="24"/>
           <w:u w:val="none"/>
         </w:rPr>
+        <w:t xml:space="preserve">Selama melaksanakan PKL, penulis ditugaskan untuk merancang dan membangun </w:t>
+      </w:r>
+      <w:r>
+        <w:rPr>
+          <w:rFonts w:ascii="Times New Roman" w:hAnsi="Times New Roman"/>
+          <w:b w:val="0"/>
+          <w:i/>
+          <w:sz w:val="24"/>
+          <w:u w:val="none"/>
+        </w:rPr>
+        <w:t xml:space="preserve">Learning Management System </w:t>
+      </w:r>
+      <w:r>
+        <w:rPr>
+          <w:rFonts w:ascii="Times New Roman" w:hAnsi="Times New Roman"/>
+          <w:b w:val="0"/>
+          <w:i w:val="0"/>
+          <w:sz w:val="24"/>
+          <w:u w:val="none"/>
+        </w:rPr>
+        <w:t xml:space="preserve">(LMS) berbasis web menggunakan </w:t>
+      </w:r>
+      <w:r>
+        <w:rPr>
+          <w:rFonts w:ascii="Times New Roman" w:hAnsi="Times New Roman"/>
+          <w:b w:val="0"/>
+          <w:i/>
+          <w:sz w:val="24"/>
+          <w:u w:val="none"/>
+        </w:rPr>
+        <w:t xml:space="preserve">framework </w:t>
+      </w:r>
+      <w:r>
+        <w:rPr>
+          <w:rFonts w:ascii="Times New Roman" w:hAnsi="Times New Roman"/>
+          <w:b w:val="0"/>
+          <w:i w:val="0"/>
+          <w:sz w:val="24"/>
+          <w:u w:val="none"/>
+        </w:rPr>
+        <w:t xml:space="preserve">Next.js pada sisi </w:t>
+      </w:r>
+      <w:r>
+        <w:rPr>
+          <w:rFonts w:ascii="Times New Roman" w:hAnsi="Times New Roman"/>
+          <w:b w:val="0"/>
+          <w:i/>
+          <w:sz w:val="24"/>
+          <w:u w:val="none"/>
+        </w:rPr>
+        <w:t xml:space="preserve">frontend </w:t>
+      </w:r>
+      <w:r>
+        <w:rPr>
+          <w:rFonts w:ascii="Times New Roman" w:hAnsi="Times New Roman"/>
+          <w:b w:val="0"/>
+          <w:i w:val="0"/>
+          <w:sz w:val="24"/>
+          <w:u w:val="none"/>
+        </w:rPr>
+        <w:t xml:space="preserve">dan Laravel pada sisi </w:t>
+      </w:r>
+      <w:r>
+        <w:rPr>
+          <w:rFonts w:ascii="Times New Roman" w:hAnsi="Times New Roman"/>
+          <w:b w:val="0"/>
+          <w:i/>
+          <w:sz w:val="24"/>
+          <w:u w:val="none"/>
+        </w:rPr>
+        <w:t xml:space="preserve">backend </w:t>
+      </w:r>
+      <w:r>
+        <w:rPr>
+          <w:rFonts w:ascii="Times New Roman" w:hAnsi="Times New Roman"/>
+          <w:b w:val="0"/>
+          <w:i w:val="0"/>
+          <w:sz w:val="24"/>
+          <w:u w:val="none"/>
+        </w:rPr>
+        <w:t>yang terintegrasi dengan basis data MySQL.</w:t>
+      </w:r>
+    </w:p>
+    <w:p>
+      <w:pPr>
+        <w:spacing w:before="0" w:after="0" w:line="360" w:lineRule="auto"/>
+        <w:ind w:firstLine="720"/>
+        <w:jc w:val="both"/>
+      </w:pPr>
+      <w:r>
+        <w:rPr>
+          <w:rFonts w:ascii="Times New Roman" w:hAnsi="Times New Roman"/>
+          <w:b w:val="0"/>
+          <w:i w:val="0"/>
+          <w:sz w:val="24"/>
+          <w:u w:val="none"/>
+        </w:rPr>
         <w:t>Melalui pelaksanaan PKL di CV Newus Teknologi, penulis memperoleh pengalaman nyata mengenai proses pengembangan sistem informasi yang berorientasi pada kebutuhan pengguna. Pengalaman tersebut tidak hanya meningkatkan kemampuan teknis dalam pengelolaan dan pengembangan sistem, tetapi juga mengembangkan kemampuan komunikasi, kerja sama tim, disiplin, serta profesionalisme kerja. Dengan demikian, kegiatan Praktik Kerja Lapangan di CV Newus Teknologi diharapkan dapat menjadi sarana untuk memperkecil kesenjangan antara teori yang diperoleh di perguruan tinggi dengan praktik yang diterapkan dalam industri teknologi informasi.</w:t>
       </w:r>
     </w:p>
@@ -4729,7 +4772,7 @@
           <w:sz w:val="24"/>
           <w:u w:val="none"/>
         </w:rPr>
-        <w:t>1) Memperoleh pengalaman kerja secara langsung dalam lingkungan industri teknologi informasi, khususnya dalam pengembangan Learning Management System berbasis web.</w:t>
+        <w:t>1) Memperoleh pengalaman kerja secara langsung dalam lingkungan industri teknologi informasi profesional di CV Newus Teknologi.</w:t>
       </w:r>
     </w:p>
     <w:p>
@@ -4746,7 +4789,7 @@
           <w:sz w:val="24"/>
           <w:u w:val="none"/>
         </w:rPr>
-        <w:t>2) Mampu menerapkan ilmu pengetahuan dan keterampilan yang telah diperoleh selama perkuliahan ke dalam dunia kerja nyata, terutama pada bidang pengembangan perangkat lunak full-stack.</w:t>
+        <w:t>2) Mampu menerapkan ilmu pengetahuan dan keterampilan yang telah diperoleh selama perkuliahan ke dalam dunia kerja nyata, terutama pada bidang pengembangan perangkat lunak full-stack modern.</w:t>
       </w:r>
     </w:p>
     <w:p>
@@ -4763,7 +4806,7 @@
           <w:sz w:val="24"/>
           <w:u w:val="none"/>
         </w:rPr>
-        <w:t>3) Meningkatkan kemampuan teknis dalam pengembangan sistem, perancangan basis data, implementasi API, serta pengujian perangkat lunak.</w:t>
+        <w:t>3) Meningkatkan kemampuan teknis dalam perancangan arsitektur sistem, pemodelan basis data relasional, implementasi RESTful API, serta pengujian sistem otomatis.</w:t>
       </w:r>
     </w:p>
     <w:p>
@@ -4797,7 +4840,7 @@
           <w:sz w:val="24"/>
           <w:u w:val="none"/>
         </w:rPr>
-        <w:t>5) Meningkatkan kemampuan komunikasi, kerja sama tim, disiplin, serta manajemen waktu yang diperlukan dalam lingkungan kerja profesional.</w:t>
+        <w:t>5) Meningkatkan kemampuan komunikasi, kerja sama tim, kedisiplinan, serta manajemen waktu yang diperlukan dalam lingkungan kerja profesional.</w:t>
       </w:r>
     </w:p>
     <w:p>
@@ -4831,7 +4874,7 @@
           <w:sz w:val="24"/>
           <w:u w:val="none"/>
         </w:rPr>
-        <w:t>1) Menjadi sarana evaluasi terhadap kesesuaian kurikulum dan materi pembelajaran dengan kebutuhan dunia industri.</w:t>
+        <w:t>1) Menjadi sarana evaluasi terhadap kesesuaian kurikulum dan materi perkuliahan dengan kebutuhan nyata dunia industri teknologi informasi.</w:t>
       </w:r>
     </w:p>
     <w:p>
@@ -4848,7 +4891,7 @@
           <w:sz w:val="24"/>
           <w:u w:val="none"/>
         </w:rPr>
-        <w:t>2) Memperkuat hubungan kerja sama antara FTIK Universitas Teknokrat Indonesia dengan perusahaan mitra pelaksanaan PKL.</w:t>
+        <w:t>2) Memperkuat jalinan kerja sama kemitraan antara FTIK Universitas Teknokrat Indonesia dengan CV Newus Teknologi sebagai industri mitra.</w:t>
       </w:r>
     </w:p>
     <w:p>
@@ -4865,7 +4908,7 @@
           <w:sz w:val="24"/>
           <w:u w:val="none"/>
         </w:rPr>
-        <w:t>3) Meningkatkan kualitas lulusan yang memiliki pengalaman kerja, kompetensi teknis, serta pemahaman terhadap kebutuhan industri.</w:t>
+        <w:t>3) Meningkatkan kualitas lulusan yang memiliki pengalaman kerja riil, kompetensi teknis teruji, serta kesiapan mental menghadapi dunia kerja.</w:t>
       </w:r>
     </w:p>
     <w:p>
@@ -4899,7 +4942,7 @@
           <w:sz w:val="24"/>
           <w:u w:val="none"/>
         </w:rPr>
-        <w:t>1) Memperoleh kontribusi tenaga kerja mahasiswa dalam pengembangan produk Learning Management System sebagai portofolio perusahaan.</w:t>
+        <w:t>1) Memperoleh kontribusi tenaga kerja mahasiswa dalam pengembangan produk Learning Management System sebagai solusi digital bagi institusi pendidikan mitra perusahaan.</w:t>
       </w:r>
     </w:p>
     <w:p>
@@ -4916,7 +4959,7 @@
           <w:sz w:val="24"/>
           <w:u w:val="none"/>
         </w:rPr>
-        <w:t>2) Mendukung penyelesaian pekerjaan operasional perusahaan melalui kontribusi mahasiswa selama pelaksanaan Praktik Kerja Lapangan.</w:t>
+        <w:t>2) Mendukung percepatan penyelesaian target proyek operasional perusahaan melalui kontribusi nyata mahasiswa selama masa PKL.</w:t>
       </w:r>
     </w:p>
     <w:p>
@@ -4933,7 +4976,7 @@
           <w:sz w:val="24"/>
           <w:u w:val="none"/>
         </w:rPr>
-        <w:t>3) Menjadi sarana bagi perusahaan untuk mengenal dan mengevaluasi potensi mahasiswa sebagai calon tenaga kerja yang kompeten di bidang teknologi informasi.</w:t>
+        <w:t>3) Menjadi sarana bagi perusahaan untuk mengenal, membina, dan mengevaluasi potensi mahasiswa sebagai calon talenta digital andal di masa mendatang.</w:t>
       </w:r>
     </w:p>
     <w:p>
@@ -4967,7 +5010,27 @@
           <w:sz w:val="24"/>
           <w:u w:val="none"/>
         </w:rPr>
-        <w:t xml:space="preserve">Pelaksanaan Kegiatan Praktik Kerja Lapangan (PKL) dilaksanakan di CV Newus Teknologi yang berlokasi di Jl. Salim Batubara No.118, Kupang Teba, Kec. Teluk Betung Utara, Kota Bandar Lampung, Lampung 35212. Selama pelaksanaan PKL, penulis bertugas sebagai </w:t>
+        <w:t xml:space="preserve">Pelaksanaan Kegiatan Praktik Kerja Lapangan (PKL) dilaksanakan di CV Newus Teknologi yang berlokasi di Jl. Salim Batubara No.118, Kupang Teba, Kec. Teluk Betung Utara, Kota Bandar Lampung, Lampung 35212 (Website resmi: </w:t>
+      </w:r>
+      <w:r>
+        <w:rPr>
+          <w:rFonts w:ascii="Times New Roman" w:hAnsi="Times New Roman"/>
+          <w:b w:val="0"/>
+          <w:i/>
+          <w:sz w:val="24"/>
+          <w:u w:val="none"/>
+        </w:rPr>
+        <w:t>https://newus.id</w:t>
+      </w:r>
+      <w:r>
+        <w:rPr>
+          <w:rFonts w:ascii="Times New Roman" w:hAnsi="Times New Roman"/>
+          <w:b w:val="0"/>
+          <w:i w:val="0"/>
+          <w:sz w:val="24"/>
+          <w:u w:val="none"/>
+        </w:rPr>
+        <w:t xml:space="preserve">). Selama pelaksanaan PKL, penulis bertugas sebagai </w:t>
       </w:r>
       <w:r>
         <w:rPr>
@@ -5203,7 +5266,7 @@
                 <w:sz w:val="20"/>
                 <w:u w:val="none"/>
               </w:rPr>
-              <w:t>Orientasi perusahaan, penentuan topik proyek PKL, wawancara kebutuhan sistem, penyusunan Product Requirements Document (PRD), dan perancangan wireframe UI/UX di Figma.</w:t>
+              <w:t>Orientasi perusahaan bersama Founder &amp; CEO Ir. Antoni, S.T., IPM, penentuan topik proyek PKL, wawancara kebutuhan sistem, penyusunan Product Requirements Document (PRD), dan perancangan wireframe UI/UX di Figma.</w:t>
             </w:r>
           </w:p>
         </w:tc>
@@ -5244,7 +5307,7 @@
                 <w:sz w:val="20"/>
                 <w:u w:val="none"/>
               </w:rPr>
-              <w:t>Perancangan skema database MySQL 11 tabel, setup repository Git, inisialisasi framework Laravel 11 backend dan Next.js frontend, implementasi autentikasi Laravel Sanctum.</w:t>
+              <w:t>Perancangan skema database MySQL 11 tabel relasional, setup repository Git, inisialisasi framework Laravel 11 backend dan Next.js frontend, implementasi autentikasi Laravel Sanctum.</w:t>
             </w:r>
           </w:p>
         </w:tc>
@@ -5285,7 +5348,7 @@
                 <w:sz w:val="20"/>
                 <w:u w:val="none"/>
               </w:rPr>
-              <w:t>Pengembangan modul kelas, materi ajar, penugasan LKPD, presensi mandiri, integrasi BroadcastChannel real-time sync, dan pembuatan antarmuka 3 dashboard peran pengguna.</w:t>
+              <w:t>Pengembangan modul kelas, materi ajar, penugasan LKPD, presensi mandiri berbasis jendela waktu, integrasi BroadcastChannel real-time sync, dan pembuatan antarmuka 3 dashboard peran pengguna.</w:t>
             </w:r>
           </w:p>
         </w:tc>
@@ -5367,7 +5430,7 @@
                 <w:sz w:val="20"/>
                 <w:u w:val="none"/>
               </w:rPr>
-              <w:t>Eksekusi automated bot testing 53 skenario (100% passed), evaluasi hasil bersama pembimbing lapangan, penyusunan dokumentasi sistem, dan penulisan laporan akhir PKL.</w:t>
+              <w:t>Eksekusi automated bot testing 53 skenario (100% passed), evaluasi hasil bersama tim pembimbing lapangan Newus Technology, penyusunan dokumentasi sistem, dan penulisan laporan akhir PKL.</w:t>
             </w:r>
           </w:p>
         </w:tc>
@@ -5449,7 +5512,27 @@
           <w:sz w:val="24"/>
           <w:u w:val="none"/>
         </w:rPr>
-        <w:t xml:space="preserve">CV Newus Teknologi merupakan perusahaan yang bergerak di bidang teknologi informasi dengan fokus pada pengembangan solusi perangkat lunak berbasis web dan </w:t>
+        <w:t xml:space="preserve">CV Newus Teknologi (dikenal secara luas sebagai </w:t>
+      </w:r>
+      <w:r>
+        <w:rPr>
+          <w:rFonts w:ascii="Times New Roman" w:hAnsi="Times New Roman"/>
+          <w:b/>
+          <w:i w:val="0"/>
+          <w:sz w:val="24"/>
+          <w:u w:val="none"/>
+        </w:rPr>
+        <w:t>Newus Technology</w:t>
+      </w:r>
+      <w:r>
+        <w:rPr>
+          <w:rFonts w:ascii="Times New Roman" w:hAnsi="Times New Roman"/>
+          <w:b w:val="0"/>
+          <w:i w:val="0"/>
+          <w:sz w:val="24"/>
+          <w:u w:val="none"/>
+        </w:rPr>
+        <w:t>) merupakan perusahaan yang bergerak di bidang teknologi informasi dengan spesialisasi sebagai pengembang perangkat lunak (</w:t>
       </w:r>
       <w:r>
         <w:rPr>
@@ -5459,17 +5542,87 @@
           <w:sz w:val="24"/>
           <w:u w:val="none"/>
         </w:rPr>
-        <w:t xml:space="preserve">mobile </w:t>
-      </w:r>
-      <w:r>
-        <w:rPr>
-          <w:rFonts w:ascii="Times New Roman" w:hAnsi="Times New Roman"/>
-          <w:b w:val="0"/>
-          <w:i w:val="0"/>
-          <w:sz w:val="24"/>
-          <w:u w:val="none"/>
-        </w:rPr>
-        <w:t>untuk berbagai sektor industri. Berdiri di Kota Bandar Lampung, perusahaan berkomitmen untuk menghadirkan solusi digital inovatif bagi institusi pendidikan, instansi pemerintah daerah, dan pelaku usaha mikro, kecil, dan menengah (UMKM).</w:t>
+        <w:t>Software Developer</w:t>
+      </w:r>
+      <w:r>
+        <w:rPr>
+          <w:rFonts w:ascii="Times New Roman" w:hAnsi="Times New Roman"/>
+          <w:b w:val="0"/>
+          <w:i w:val="0"/>
+          <w:sz w:val="24"/>
+          <w:u w:val="none"/>
+        </w:rPr>
+        <w:t>) dan konsultan teknologi informasi (</w:t>
+      </w:r>
+      <w:r>
+        <w:rPr>
+          <w:rFonts w:ascii="Times New Roman" w:hAnsi="Times New Roman"/>
+          <w:b w:val="0"/>
+          <w:i/>
+          <w:sz w:val="24"/>
+          <w:u w:val="none"/>
+        </w:rPr>
+        <w:t>IT Consultant</w:t>
+      </w:r>
+      <w:r>
+        <w:rPr>
+          <w:rFonts w:ascii="Times New Roman" w:hAnsi="Times New Roman"/>
+          <w:b w:val="0"/>
+          <w:i w:val="0"/>
+          <w:sz w:val="24"/>
+          <w:u w:val="none"/>
+        </w:rPr>
+        <w:t xml:space="preserve">) profesional. Perusahaan ini didirikan pada tahun 2021 oleh </w:t>
+      </w:r>
+      <w:r>
+        <w:rPr>
+          <w:rFonts w:ascii="Times New Roman" w:hAnsi="Times New Roman"/>
+          <w:b/>
+          <w:i w:val="0"/>
+          <w:sz w:val="24"/>
+          <w:u w:val="none"/>
+        </w:rPr>
+        <w:t xml:space="preserve">Ir. Antoni, S.T., IPM </w:t>
+      </w:r>
+      <w:r>
+        <w:rPr>
+          <w:rFonts w:ascii="Times New Roman" w:hAnsi="Times New Roman"/>
+          <w:b w:val="0"/>
+          <w:i w:val="0"/>
+          <w:sz w:val="24"/>
+          <w:u w:val="none"/>
+        </w:rPr>
+        <w:t xml:space="preserve">yang menjabat sebagai </w:t>
+      </w:r>
+      <w:r>
+        <w:rPr>
+          <w:rFonts w:ascii="Times New Roman" w:hAnsi="Times New Roman"/>
+          <w:b w:val="0"/>
+          <w:i/>
+          <w:sz w:val="24"/>
+          <w:u w:val="none"/>
+        </w:rPr>
+        <w:t xml:space="preserve">Founder &amp; Chief Executive Officer (CEO). </w:t>
+      </w:r>
+      <w:r>
+        <w:rPr>
+          <w:rFonts w:ascii="Times New Roman" w:hAnsi="Times New Roman"/>
+          <w:b w:val="0"/>
+          <w:i w:val="0"/>
+          <w:sz w:val="24"/>
+          <w:u w:val="none"/>
+        </w:rPr>
+        <w:t xml:space="preserve">Kantor pusat perusahaan berkedudukan di Jl. Salim Batubara No.118, Kupang Teba, Kec. Teluk Betung Utara, Kota Bandar Lampung, Lampung 35212 dengan portal informasi resmi dapat diakses melalui laman </w:t>
+      </w:r>
+      <w:r>
+        <w:rPr>
+          <w:rFonts w:ascii="Times New Roman" w:hAnsi="Times New Roman"/>
+          <w:b w:val="0"/>
+          <w:i/>
+          <w:sz w:val="24"/>
+          <w:u w:val="none"/>
+        </w:rPr>
+        <w:t>https://newus.id.</w:t>
       </w:r>
     </w:p>
     <w:p>
@@ -5486,7 +5639,27 @@
           <w:sz w:val="24"/>
           <w:u w:val="none"/>
         </w:rPr>
-        <w:t>Sejak awal berdiri, CV Newus Teknologi tidak hanya berperan sebagai pengembang perangkat lunak, tetapi juga sebagai konsultan teknologi informasi yang memiliki pemahaman mendalam mengenai arsitektur, pengembangan, dan implementasi sistem informasi dalam kegiatan operasional perusahaan. Dengan pengalaman tersebut, perusahaan berkomitmen untuk menghadirkan solusi teknologi yang mampu mendukung efektivitas, efisiensi, serta kelancaran proses operasional di berbagai bidang industri.</w:t>
+        <w:t>Sejak awal pendiriannya pada tahun 2021, Newus Technology memiliki komitmen kuat untuk memimpin pengembangan ekosistem dan sistem digital yang terukur (</w:t>
+      </w:r>
+      <w:r>
+        <w:rPr>
+          <w:rFonts w:ascii="Times New Roman" w:hAnsi="Times New Roman"/>
+          <w:b w:val="0"/>
+          <w:i/>
+          <w:sz w:val="24"/>
+          <w:u w:val="none"/>
+        </w:rPr>
+        <w:t>scalable digital systems</w:t>
+      </w:r>
+      <w:r>
+        <w:rPr>
+          <w:rFonts w:ascii="Times New Roman" w:hAnsi="Times New Roman"/>
+          <w:b w:val="0"/>
+          <w:i w:val="0"/>
+          <w:sz w:val="24"/>
+          <w:u w:val="none"/>
+        </w:rPr>
+        <w:t>) bagi sektor instansi pemerintahan, fasilitas kesehatan (rumah sakit dan klinik), institusi pendidikan, korporasi swasta, serta pelaku Usaha Mikro, Kecil, dan Menengah (UMKM) di seluruh wilayah Indonesia. Hingga saat ini, Newus Technology telah berhasil menyelesaikan dan mengimplementasikan lebih dari 100 solusi teknologi digital, dengan fokus utama pada efisiensi operasional, transformasi digital terpadu, dan otomatisasi berbasis teknologi modern.</w:t>
       </w:r>
     </w:p>
     <w:p>
@@ -5503,7 +5676,7 @@
           <w:sz w:val="24"/>
           <w:u w:val="none"/>
         </w:rPr>
-        <w:t>Visi perusahaan adalah menjadi perusahaan konsultan dan pengembang perangkat lunak terdepan di Indonesia yang berdaya saing serta mampu menghadirkan solusi teknologi digital yang berdampak nyata bagi kemajuan masyarakat dan industri. Misi perusahaan diwujudkan melalui penyediaan layanan konsultasi, implementasi, pengembangan perangkat lunak, integrasi sistem, serta inovasi teknologi yang mendukung keberhasilan transformasi digital pada berbagai sektor.</w:t>
+        <w:t>Visi utama CV Newus Teknologi adalah menjadi perusahaan konsultan dan pengembang perangkat lunak terdepan di Indonesia yang berdaya saing global serta mampu menghadirkan ekosistem teknologi praktis yang memberikan dampak terukur (measurable impact) dan keberlanjutan jangka panjang bagi kemajuan masyarakat, pemerintahan, dan industri.</w:t>
       </w:r>
     </w:p>
     <w:p>
@@ -5520,7 +5693,92 @@
           <w:sz w:val="24"/>
           <w:u w:val="none"/>
         </w:rPr>
-        <w:t>Dalam perkembangannya, CV Newus Teknologi terus melakukan inovasi dan pengembangan sumber daya manusia guna menjaga kualitas layanan yang diberikan. Didukung oleh tenaga profesional yang kompeten, perusahaan berupaya menjadi mitra teknologi yang andal dalam membantu transformasi digital dan integrasi sistem operasional perusahaan. Logo CV Newus Teknologi ditunjukkan pada Gambar 2.1.</w:t>
+        <w:t>Misi perusahaan diwujudkan melalui:</w:t>
+      </w:r>
+    </w:p>
+    <w:p>
+      <w:pPr>
+        <w:spacing w:before="0" w:after="0" w:line="360" w:lineRule="auto"/>
+        <w:ind w:left="357"/>
+        <w:jc w:val="both"/>
+      </w:pPr>
+      <w:r>
+        <w:rPr>
+          <w:rFonts w:ascii="Times New Roman" w:hAnsi="Times New Roman"/>
+          <w:b w:val="0"/>
+          <w:i w:val="0"/>
+          <w:sz w:val="24"/>
+          <w:u w:val="none"/>
+        </w:rPr>
+        <w:t>1) Mengembangkan solusi perangkat lunak berkualitas tinggi dengan mengadopsi standar arsitektur sistem modern, performa tinggi, aman, dan mudah dikembangkan (scalable).</w:t>
+      </w:r>
+    </w:p>
+    <w:p>
+      <w:pPr>
+        <w:spacing w:before="0" w:after="0" w:line="360" w:lineRule="auto"/>
+        <w:ind w:left="357"/>
+        <w:jc w:val="both"/>
+      </w:pPr>
+      <w:r>
+        <w:rPr>
+          <w:rFonts w:ascii="Times New Roman" w:hAnsi="Times New Roman"/>
+          <w:b w:val="0"/>
+          <w:i w:val="0"/>
+          <w:sz w:val="24"/>
+          <w:u w:val="none"/>
+        </w:rPr>
+        <w:t>2) Memberikan layanan konsultasi teknologi informasi yang solutif, transparan, dan memberikan nilai tambah nyata bagi transformasi digital para mitra bisnis dan instansi pemerintah.</w:t>
+      </w:r>
+    </w:p>
+    <w:p>
+      <w:pPr>
+        <w:spacing w:before="0" w:after="0" w:line="360" w:lineRule="auto"/>
+        <w:ind w:left="357"/>
+        <w:jc w:val="both"/>
+      </w:pPr>
+      <w:r>
+        <w:rPr>
+          <w:rFonts w:ascii="Times New Roman" w:hAnsi="Times New Roman"/>
+          <w:b w:val="0"/>
+          <w:i w:val="0"/>
+          <w:sz w:val="24"/>
+          <w:u w:val="none"/>
+        </w:rPr>
+        <w:t>3) Membangun ekosistem kerja yang profesional, kolaboratif, dan inovatif yang mendukung pembinaan dan akselerasi talenta digital muda Indonesia.</w:t>
+      </w:r>
+    </w:p>
+    <w:p>
+      <w:pPr>
+        <w:spacing w:before="0" w:after="0" w:line="360" w:lineRule="auto"/>
+        <w:ind w:left="357"/>
+        <w:jc w:val="both"/>
+      </w:pPr>
+      <w:r>
+        <w:rPr>
+          <w:rFonts w:ascii="Times New Roman" w:hAnsi="Times New Roman"/>
+          <w:b w:val="0"/>
+          <w:i w:val="0"/>
+          <w:sz w:val="24"/>
+          <w:u w:val="none"/>
+        </w:rPr>
+        <w:t>4) Mendukung digitalisasi sektor pendidikan melalui penyediaan platform e-learning, smart school management systems, dan integrasi data akademik terpusat.</w:t>
+      </w:r>
+    </w:p>
+    <w:p>
+      <w:pPr>
+        <w:spacing w:before="0" w:after="0" w:line="360" w:lineRule="auto"/>
+        <w:ind w:firstLine="720"/>
+        <w:jc w:val="both"/>
+      </w:pPr>
+      <w:r>
+        <w:rPr>
+          <w:rFonts w:ascii="Times New Roman" w:hAnsi="Times New Roman"/>
+          <w:b w:val="0"/>
+          <w:i w:val="0"/>
+          <w:sz w:val="24"/>
+          <w:u w:val="none"/>
+        </w:rPr>
+        <w:t>Logo resmi CV Newus Teknologi ditunjukkan pada Gambar 2.1.</w:t>
       </w:r>
     </w:p>
     <w:p>
@@ -5536,7 +5794,7 @@
           <w:sz w:val="22"/>
           <w:u w:val="none"/>
         </w:rPr>
-        <w:t>[Gambar untuk Logo CV Newus Teknologi]</w:t>
+        <w:t>[Gambar untuk Logo Resmi CV Newus Teknologi]</w:t>
       </w:r>
     </w:p>
     <w:p>
@@ -5586,7 +5844,193 @@
           <w:sz w:val="24"/>
           <w:u w:val="none"/>
         </w:rPr>
-        <w:t>Struktur organisasi CV Newus Teknologi disusun untuk mendukung efektivitas operasional perusahaan dalam memberikan layanan teknologi informasi kepada klien. Perusahaan dipimpin oleh seorang Direktur yang membawahi beberapa divisi utama, yaitu Divisi Pengembangan Perangkat Lunak (Software Engineering), Divisi Desain UI/UX, Divisi Infrastruktur dan Operasional Cloud, serta Divisi Pemasaran dan Hubungan Pelanggan. Setiap divisi dipimpin oleh seorang kepala divisi yang bertanggung jawab langsung kepada Direktur dalam mengawasi pelaksanaan proyek dan memastikan standar kualitas terpenuhi. Adapun struktur organisasi CV Newus Teknologi dapat dilihat pada Gambar 2.2.</w:t>
+        <w:t xml:space="preserve">Struktur organisasi CV Newus Teknologi disusun secara profesional dan terencana guna mendukung kelancaran operasional, pembagian tugas yang jelas, dan pengawasan mutu pada setiap proyek teknologi yang dikerjakan. Perusahaan dipimpin oleh seorang </w:t>
+      </w:r>
+      <w:r>
+        <w:rPr>
+          <w:rFonts w:ascii="Times New Roman" w:hAnsi="Times New Roman"/>
+          <w:b w:val="0"/>
+          <w:i/>
+          <w:sz w:val="24"/>
+          <w:u w:val="none"/>
+        </w:rPr>
+        <w:t xml:space="preserve">Founder &amp; CEO </w:t>
+      </w:r>
+      <w:r>
+        <w:rPr>
+          <w:rFonts w:ascii="Times New Roman" w:hAnsi="Times New Roman"/>
+          <w:b w:val="0"/>
+          <w:i w:val="0"/>
+          <w:sz w:val="24"/>
+          <w:u w:val="none"/>
+        </w:rPr>
+        <w:t>yang membawahi divisi manajerial dan divisi teknis. Struktur organisasi perusahaan terdiri dari unit-unit kerja sebagai berikut:</w:t>
+      </w:r>
+    </w:p>
+    <w:p>
+      <w:pPr>
+        <w:spacing w:before="0" w:after="0" w:line="360" w:lineRule="auto"/>
+        <w:ind w:left="357"/>
+        <w:jc w:val="both"/>
+      </w:pPr>
+      <w:r>
+        <w:rPr>
+          <w:rFonts w:ascii="Times New Roman" w:hAnsi="Times New Roman"/>
+          <w:b w:val="0"/>
+          <w:i w:val="0"/>
+          <w:sz w:val="24"/>
+          <w:u w:val="none"/>
+        </w:rPr>
+        <w:t>1) Direksi Utama (Executive Leadership): Dipimpin langsung oleh Ir. Antoni, S.T., IPM selaku Founder &amp; CEO yang bertanggung jawab atas arah strategis perusahaan, kemitraan strategis, serta visi pengembangan produk teknologi.</w:t>
+      </w:r>
+    </w:p>
+    <w:p>
+      <w:pPr>
+        <w:spacing w:before="0" w:after="0" w:line="360" w:lineRule="auto"/>
+        <w:ind w:left="357"/>
+        <w:jc w:val="both"/>
+      </w:pPr>
+      <w:r>
+        <w:rPr>
+          <w:rFonts w:ascii="Times New Roman" w:hAnsi="Times New Roman"/>
+          <w:b w:val="0"/>
+          <w:i w:val="0"/>
+          <w:sz w:val="24"/>
+          <w:u w:val="none"/>
+        </w:rPr>
+        <w:t>2) Divisi Manajemen Proyek (Project Management): Dikoordinasikan oleh Project Manager (Retno Wardani dan Lulu Agustin) yang bertugas mengelola siklus proyek, memantau timeline, mengoordinasikan kebutuhan klien dengan tim teknis, serta memastikan kepatuhan terhadap Product Requirements Document (PRD).</w:t>
+      </w:r>
+    </w:p>
+    <w:p>
+      <w:pPr>
+        <w:spacing w:before="0" w:after="0" w:line="360" w:lineRule="auto"/>
+        <w:ind w:left="357"/>
+        <w:jc w:val="both"/>
+      </w:pPr>
+      <w:r>
+        <w:rPr>
+          <w:rFonts w:ascii="Times New Roman" w:hAnsi="Times New Roman"/>
+          <w:b w:val="0"/>
+          <w:i w:val="0"/>
+          <w:sz w:val="24"/>
+          <w:u w:val="none"/>
+        </w:rPr>
+        <w:t>3) Divisi Pengembangan Perangkat Lunak (Software Engineering &amp; IT):</w:t>
+      </w:r>
+    </w:p>
+    <w:p>
+      <w:pPr>
+        <w:spacing w:before="0" w:after="0" w:line="360" w:lineRule="auto"/>
+        <w:jc w:val="both"/>
+      </w:pPr>
+      <w:r>
+        <w:rPr>
+          <w:rFonts w:ascii="Times New Roman" w:hAnsi="Times New Roman"/>
+          <w:b w:val="0"/>
+          <w:i w:val="0"/>
+          <w:sz w:val="24"/>
+          <w:u w:val="none"/>
+        </w:rPr>
+        <w:t>a) Tim Frontend Developer: Dipimpin oleh Hamdan Habibi (Leader Front End Developer) dan Aldi Nugraha (Leader Front End), bersama Robi Hardinata, Bendry Lakburlawal, dan Ariston Rais Zidane, yang berfokus membangun antarmuka web modern, interaktif, responsif, dan performa tinggi menggunakan Next.js, React, dan Tailwind CSS.</w:t>
+      </w:r>
+    </w:p>
+    <w:p>
+      <w:pPr>
+        <w:spacing w:before="0" w:after="0" w:line="360" w:lineRule="auto"/>
+        <w:jc w:val="both"/>
+      </w:pPr>
+      <w:r>
+        <w:rPr>
+          <w:rFonts w:ascii="Times New Roman" w:hAnsi="Times New Roman"/>
+          <w:b w:val="0"/>
+          <w:i w:val="0"/>
+          <w:sz w:val="24"/>
+          <w:u w:val="none"/>
+        </w:rPr>
+        <w:t>b) Tim Backend Developer &amp; Database: Dipimpin oleh Muhammad Qomarudin (Leader Back-End Developer) dan Syukron Ma'mun (Tenaga Ahli Basis Data &amp; Database), didukung Geraldine Firdaus, M. G Arma Yoga Pratama, dan Muhammad Muttaqin, yang bertanggung jawab atas perancangan database relasional, pengembangan RESTful API, keamanan autentikasi, dan skalabilitas server menggunakan Laravel, Node.js, dan MySQL.</w:t>
+      </w:r>
+    </w:p>
+    <w:p>
+      <w:pPr>
+        <w:spacing w:before="0" w:after="0" w:line="360" w:lineRule="auto"/>
+        <w:jc w:val="both"/>
+      </w:pPr>
+      <w:r>
+        <w:rPr>
+          <w:rFonts w:ascii="Times New Roman" w:hAnsi="Times New Roman"/>
+          <w:b w:val="0"/>
+          <w:i w:val="0"/>
+          <w:sz w:val="24"/>
+          <w:u w:val="none"/>
+        </w:rPr>
+        <w:t>c) Tim UI/UX Design: Dipimpin oleh Qurrota Aini Dila (Leader UI/UX Designer) bersama Muhammad Raihan Puteranda dan Irsyad Abi Izzulhaq, yang bertugas melakukan riset pengguna, perancangan wireframe, user flow, dan high-fidelity prototype interaktif di Figma.</w:t>
+      </w:r>
+    </w:p>
+    <w:p>
+      <w:pPr>
+        <w:spacing w:before="0" w:after="0" w:line="360" w:lineRule="auto"/>
+        <w:jc w:val="both"/>
+      </w:pPr>
+      <w:r>
+        <w:rPr>
+          <w:rFonts w:ascii="Times New Roman" w:hAnsi="Times New Roman"/>
+          <w:b w:val="0"/>
+          <w:i w:val="0"/>
+          <w:sz w:val="24"/>
+          <w:u w:val="none"/>
+        </w:rPr>
+        <w:t>d) Tim DevOps &amp; Quality Assurance: Dikelola oleh Muhammad Nur Ashiddiqi (DevOps Engineer) yang bertanggung jawab atas infrastruktur cloud, deployment, dan otomatisasi CI/CD, serta Aditya Pangestu (Quality Assurance) yang bertugas menyusun skenario pengujian dan memastikan kualitas perangkat lunak bebas dari kecacatan (bug-free).</w:t>
+      </w:r>
+    </w:p>
+    <w:p>
+      <w:pPr>
+        <w:spacing w:before="0" w:after="0" w:line="360" w:lineRule="auto"/>
+        <w:ind w:left="357"/>
+        <w:jc w:val="both"/>
+      </w:pPr>
+      <w:r>
+        <w:rPr>
+          <w:rFonts w:ascii="Times New Roman" w:hAnsi="Times New Roman"/>
+          <w:b w:val="0"/>
+          <w:i w:val="0"/>
+          <w:sz w:val="24"/>
+          <w:u w:val="none"/>
+        </w:rPr>
+        <w:t>4) Divisi Operasional, Keuangan &amp; Human Resources: Dikelola oleh Icha Aquinalda (Operasional Manager), Elvi Kholifatul Jannah (Admin Finance), dan Irene Nadia Vaniarinanta (Human Resources Officer) yang mengurus administrasi, keuangan, dan tata kelola SDM.</w:t>
+      </w:r>
+    </w:p>
+    <w:p>
+      <w:pPr>
+        <w:spacing w:before="0" w:after="0" w:line="360" w:lineRule="auto"/>
+        <w:ind w:left="357"/>
+        <w:jc w:val="both"/>
+      </w:pPr>
+      <w:r>
+        <w:rPr>
+          <w:rFonts w:ascii="Times New Roman" w:hAnsi="Times New Roman"/>
+          <w:b w:val="0"/>
+          <w:i w:val="0"/>
+          <w:sz w:val="24"/>
+          <w:u w:val="none"/>
+        </w:rPr>
+        <w:t>5) Divisi Business Development &amp; Marketing: Dikelola oleh Yulivia Annisa Putri (Business Strategy Manager), Fadilla Pusvitasari (Business Development), dan Miacika Putri Paramitha (SEO Content Writer) yang bertanggung jawab atas perluasan pasar, strategi SEO, dan kemitraan klien.</w:t>
+      </w:r>
+    </w:p>
+    <w:p>
+      <w:pPr>
+        <w:spacing w:before="0" w:after="0" w:line="360" w:lineRule="auto"/>
+        <w:ind w:firstLine="720"/>
+        <w:jc w:val="both"/>
+      </w:pPr>
+      <w:r>
+        <w:rPr>
+          <w:rFonts w:ascii="Times New Roman" w:hAnsi="Times New Roman"/>
+          <w:b w:val="0"/>
+          <w:i w:val="0"/>
+          <w:sz w:val="24"/>
+          <w:u w:val="none"/>
+        </w:rPr>
+        <w:t>Bagan Struktur Organisasi CV Newus Teknologi ditunjukkan pada Gambar 2.2, dan daftar susunan tim inti perusahaan dirangkum pada Tabel 2.1.</w:t>
       </w:r>
     </w:p>
     <w:p>
@@ -5602,7 +6046,7 @@
           <w:sz w:val="22"/>
           <w:u w:val="none"/>
         </w:rPr>
-        <w:t>[Gambar untuk Struktur Organisasi CV Newus Teknologi]</w:t>
+        <w:t>[Gambar untuk Bagan Struktur Organisasi CV Newus Teknologi]</w:t>
       </w:r>
     </w:p>
     <w:p>
@@ -5621,6 +6065,942 @@
         <w:t>Gambar 2.2 Struktur Organisasi CV Newus Teknologi</w:t>
       </w:r>
     </w:p>
+    <w:p>
+      <w:pPr>
+        <w:keepNext/>
+        <w:spacing w:before="120" w:after="0" w:line="240" w:lineRule="auto"/>
+        <w:jc w:val="center"/>
+      </w:pPr>
+      <w:r>
+        <w:rPr>
+          <w:rFonts w:ascii="Times New Roman" w:hAnsi="Times New Roman"/>
+          <w:b w:val="0"/>
+          <w:i w:val="0"/>
+          <w:sz w:val="24"/>
+          <w:u w:val="none"/>
+        </w:rPr>
+        <w:t>Tabel 2.1 Daftar Susunan Tim Inti CV Newus Teknologi</w:t>
+      </w:r>
+    </w:p>
+    <w:tbl>
+      <w:tblPr>
+        <w:tblW w:type="auto" w:w="0"/>
+        <w:jc w:val="center"/>
+        <w:tblLook w:firstColumn="1" w:firstRow="1" w:lastColumn="0" w:lastRow="0" w:noHBand="0" w:noVBand="1" w:val="04A0"/>
+      </w:tblPr>
+      <w:tblGrid>
+        <w:gridCol w:w="1984"/>
+        <w:gridCol w:w="1984"/>
+        <w:gridCol w:w="1984"/>
+        <w:gridCol w:w="1984"/>
+      </w:tblGrid>
+      <w:tr>
+        <w:tc>
+          <w:tcPr>
+            <w:tcW w:type="dxa" w:w="1984"/>
+            <w:shd w:fill="D9E2F3"/>
+          </w:tcPr>
+          <w:p>
+            <w:pPr>
+              <w:jc w:val="center"/>
+            </w:pPr>
+            <w:r>
+              <w:rPr>
+                <w:rFonts w:ascii="Times New Roman" w:hAnsi="Times New Roman"/>
+                <w:b/>
+                <w:i w:val="0"/>
+                <w:sz w:val="20"/>
+                <w:u w:val="none"/>
+              </w:rPr>
+              <w:t>No</w:t>
+            </w:r>
+          </w:p>
+        </w:tc>
+        <w:tc>
+          <w:tcPr>
+            <w:tcW w:type="dxa" w:w="1984"/>
+            <w:shd w:fill="D9E2F3"/>
+          </w:tcPr>
+          <w:p>
+            <w:pPr>
+              <w:jc w:val="center"/>
+            </w:pPr>
+            <w:r>
+              <w:rPr>
+                <w:rFonts w:ascii="Times New Roman" w:hAnsi="Times New Roman"/>
+                <w:b/>
+                <w:i w:val="0"/>
+                <w:sz w:val="20"/>
+                <w:u w:val="none"/>
+              </w:rPr>
+              <w:t>Nama</w:t>
+            </w:r>
+          </w:p>
+        </w:tc>
+        <w:tc>
+          <w:tcPr>
+            <w:tcW w:type="dxa" w:w="1984"/>
+            <w:shd w:fill="D9E2F3"/>
+          </w:tcPr>
+          <w:p>
+            <w:pPr>
+              <w:jc w:val="center"/>
+            </w:pPr>
+            <w:r>
+              <w:rPr>
+                <w:rFonts w:ascii="Times New Roman" w:hAnsi="Times New Roman"/>
+                <w:b/>
+                <w:i w:val="0"/>
+                <w:sz w:val="20"/>
+                <w:u w:val="none"/>
+              </w:rPr>
+              <w:t>Jabatan / Posisi</w:t>
+            </w:r>
+          </w:p>
+        </w:tc>
+        <w:tc>
+          <w:tcPr>
+            <w:tcW w:type="dxa" w:w="1984"/>
+            <w:shd w:fill="D9E2F3"/>
+          </w:tcPr>
+          <w:p>
+            <w:pPr>
+              <w:jc w:val="center"/>
+            </w:pPr>
+            <w:r>
+              <w:rPr>
+                <w:rFonts w:ascii="Times New Roman" w:hAnsi="Times New Roman"/>
+                <w:b/>
+                <w:i w:val="0"/>
+                <w:sz w:val="20"/>
+                <w:u w:val="none"/>
+              </w:rPr>
+              <w:t>Divisi</w:t>
+            </w:r>
+          </w:p>
+        </w:tc>
+      </w:tr>
+      <w:tr>
+        <w:tc>
+          <w:tcPr>
+            <w:tcW w:type="dxa" w:w="1984"/>
+          </w:tcPr>
+          <w:p>
+            <w:pPr>
+              <w:jc w:val="center"/>
+            </w:pPr>
+            <w:r>
+              <w:rPr>
+                <w:rFonts w:ascii="Times New Roman" w:hAnsi="Times New Roman"/>
+                <w:b w:val="0"/>
+                <w:i w:val="0"/>
+                <w:sz w:val="20"/>
+                <w:u w:val="none"/>
+              </w:rPr>
+              <w:t>1</w:t>
+            </w:r>
+          </w:p>
+        </w:tc>
+        <w:tc>
+          <w:tcPr>
+            <w:tcW w:type="dxa" w:w="1984"/>
+          </w:tcPr>
+          <w:p>
+            <w:pPr>
+              <w:jc w:val="left"/>
+            </w:pPr>
+            <w:r>
+              <w:rPr>
+                <w:rFonts w:ascii="Times New Roman" w:hAnsi="Times New Roman"/>
+                <w:b/>
+                <w:i w:val="0"/>
+                <w:sz w:val="20"/>
+                <w:u w:val="none"/>
+              </w:rPr>
+              <w:t>Ir. Antoni, S.T., IPM</w:t>
+            </w:r>
+          </w:p>
+        </w:tc>
+        <w:tc>
+          <w:tcPr>
+            <w:tcW w:type="dxa" w:w="1984"/>
+          </w:tcPr>
+          <w:p>
+            <w:pPr>
+              <w:jc w:val="left"/>
+            </w:pPr>
+            <w:r>
+              <w:rPr>
+                <w:rFonts w:ascii="Times New Roman" w:hAnsi="Times New Roman"/>
+                <w:b w:val="0"/>
+                <w:i w:val="0"/>
+                <w:sz w:val="20"/>
+                <w:u w:val="none"/>
+              </w:rPr>
+              <w:t>Founder &amp; CEO</w:t>
+            </w:r>
+          </w:p>
+        </w:tc>
+        <w:tc>
+          <w:tcPr>
+            <w:tcW w:type="dxa" w:w="1984"/>
+          </w:tcPr>
+          <w:p>
+            <w:pPr>
+              <w:jc w:val="left"/>
+            </w:pPr>
+            <w:r>
+              <w:rPr>
+                <w:rFonts w:ascii="Times New Roman" w:hAnsi="Times New Roman"/>
+                <w:b w:val="0"/>
+                <w:i w:val="0"/>
+                <w:sz w:val="20"/>
+                <w:u w:val="none"/>
+              </w:rPr>
+              <w:t>Direksi Utama</w:t>
+            </w:r>
+          </w:p>
+        </w:tc>
+      </w:tr>
+      <w:tr>
+        <w:tc>
+          <w:tcPr>
+            <w:tcW w:type="dxa" w:w="1984"/>
+          </w:tcPr>
+          <w:p>
+            <w:pPr>
+              <w:jc w:val="center"/>
+            </w:pPr>
+            <w:r>
+              <w:rPr>
+                <w:rFonts w:ascii="Times New Roman" w:hAnsi="Times New Roman"/>
+                <w:b w:val="0"/>
+                <w:i w:val="0"/>
+                <w:sz w:val="20"/>
+                <w:u w:val="none"/>
+              </w:rPr>
+              <w:t>2</w:t>
+            </w:r>
+          </w:p>
+        </w:tc>
+        <w:tc>
+          <w:tcPr>
+            <w:tcW w:type="dxa" w:w="1984"/>
+          </w:tcPr>
+          <w:p>
+            <w:pPr>
+              <w:jc w:val="left"/>
+            </w:pPr>
+            <w:r>
+              <w:rPr>
+                <w:rFonts w:ascii="Times New Roman" w:hAnsi="Times New Roman"/>
+                <w:b w:val="0"/>
+                <w:i w:val="0"/>
+                <w:sz w:val="20"/>
+                <w:u w:val="none"/>
+              </w:rPr>
+              <w:t>Retno Wardani</w:t>
+            </w:r>
+          </w:p>
+        </w:tc>
+        <w:tc>
+          <w:tcPr>
+            <w:tcW w:type="dxa" w:w="1984"/>
+          </w:tcPr>
+          <w:p>
+            <w:pPr>
+              <w:jc w:val="left"/>
+            </w:pPr>
+            <w:r>
+              <w:rPr>
+                <w:rFonts w:ascii="Times New Roman" w:hAnsi="Times New Roman"/>
+                <w:b w:val="0"/>
+                <w:i w:val="0"/>
+                <w:sz w:val="20"/>
+                <w:u w:val="none"/>
+              </w:rPr>
+              <w:t>Project Manager</w:t>
+            </w:r>
+          </w:p>
+        </w:tc>
+        <w:tc>
+          <w:tcPr>
+            <w:tcW w:type="dxa" w:w="1984"/>
+          </w:tcPr>
+          <w:p>
+            <w:pPr>
+              <w:jc w:val="left"/>
+            </w:pPr>
+            <w:r>
+              <w:rPr>
+                <w:rFonts w:ascii="Times New Roman" w:hAnsi="Times New Roman"/>
+                <w:b w:val="0"/>
+                <w:i w:val="0"/>
+                <w:sz w:val="20"/>
+                <w:u w:val="none"/>
+              </w:rPr>
+              <w:t>Project Management</w:t>
+            </w:r>
+          </w:p>
+        </w:tc>
+      </w:tr>
+      <w:tr>
+        <w:tc>
+          <w:tcPr>
+            <w:tcW w:type="dxa" w:w="1984"/>
+          </w:tcPr>
+          <w:p>
+            <w:pPr>
+              <w:jc w:val="center"/>
+            </w:pPr>
+            <w:r>
+              <w:rPr>
+                <w:rFonts w:ascii="Times New Roman" w:hAnsi="Times New Roman"/>
+                <w:b w:val="0"/>
+                <w:i w:val="0"/>
+                <w:sz w:val="20"/>
+                <w:u w:val="none"/>
+              </w:rPr>
+              <w:t>3</w:t>
+            </w:r>
+          </w:p>
+        </w:tc>
+        <w:tc>
+          <w:tcPr>
+            <w:tcW w:type="dxa" w:w="1984"/>
+          </w:tcPr>
+          <w:p>
+            <w:pPr>
+              <w:jc w:val="left"/>
+            </w:pPr>
+            <w:r>
+              <w:rPr>
+                <w:rFonts w:ascii="Times New Roman" w:hAnsi="Times New Roman"/>
+                <w:b w:val="0"/>
+                <w:i w:val="0"/>
+                <w:sz w:val="20"/>
+                <w:u w:val="none"/>
+              </w:rPr>
+              <w:t>Hamdan Habibi</w:t>
+            </w:r>
+          </w:p>
+        </w:tc>
+        <w:tc>
+          <w:tcPr>
+            <w:tcW w:type="dxa" w:w="1984"/>
+          </w:tcPr>
+          <w:p>
+            <w:pPr>
+              <w:jc w:val="left"/>
+            </w:pPr>
+            <w:r>
+              <w:rPr>
+                <w:rFonts w:ascii="Times New Roman" w:hAnsi="Times New Roman"/>
+                <w:b w:val="0"/>
+                <w:i w:val="0"/>
+                <w:sz w:val="20"/>
+                <w:u w:val="none"/>
+              </w:rPr>
+              <w:t>Leader Front End Developer</w:t>
+            </w:r>
+          </w:p>
+        </w:tc>
+        <w:tc>
+          <w:tcPr>
+            <w:tcW w:type="dxa" w:w="1984"/>
+          </w:tcPr>
+          <w:p>
+            <w:pPr>
+              <w:jc w:val="left"/>
+            </w:pPr>
+            <w:r>
+              <w:rPr>
+                <w:rFonts w:ascii="Times New Roman" w:hAnsi="Times New Roman"/>
+                <w:b w:val="0"/>
+                <w:i w:val="0"/>
+                <w:sz w:val="20"/>
+                <w:u w:val="none"/>
+              </w:rPr>
+              <w:t>Frontend Development</w:t>
+            </w:r>
+          </w:p>
+        </w:tc>
+      </w:tr>
+      <w:tr>
+        <w:tc>
+          <w:tcPr>
+            <w:tcW w:type="dxa" w:w="1984"/>
+          </w:tcPr>
+          <w:p>
+            <w:pPr>
+              <w:jc w:val="center"/>
+            </w:pPr>
+            <w:r>
+              <w:rPr>
+                <w:rFonts w:ascii="Times New Roman" w:hAnsi="Times New Roman"/>
+                <w:b w:val="0"/>
+                <w:i w:val="0"/>
+                <w:sz w:val="20"/>
+                <w:u w:val="none"/>
+              </w:rPr>
+              <w:t>4</w:t>
+            </w:r>
+          </w:p>
+        </w:tc>
+        <w:tc>
+          <w:tcPr>
+            <w:tcW w:type="dxa" w:w="1984"/>
+          </w:tcPr>
+          <w:p>
+            <w:pPr>
+              <w:jc w:val="left"/>
+            </w:pPr>
+            <w:r>
+              <w:rPr>
+                <w:rFonts w:ascii="Times New Roman" w:hAnsi="Times New Roman"/>
+                <w:b w:val="0"/>
+                <w:i w:val="0"/>
+                <w:sz w:val="20"/>
+                <w:u w:val="none"/>
+              </w:rPr>
+              <w:t>Muhammad Qomarudin</w:t>
+            </w:r>
+          </w:p>
+        </w:tc>
+        <w:tc>
+          <w:tcPr>
+            <w:tcW w:type="dxa" w:w="1984"/>
+          </w:tcPr>
+          <w:p>
+            <w:pPr>
+              <w:jc w:val="left"/>
+            </w:pPr>
+            <w:r>
+              <w:rPr>
+                <w:rFonts w:ascii="Times New Roman" w:hAnsi="Times New Roman"/>
+                <w:b w:val="0"/>
+                <w:i w:val="0"/>
+                <w:sz w:val="20"/>
+                <w:u w:val="none"/>
+              </w:rPr>
+              <w:t>Leader Back-End Developer</w:t>
+            </w:r>
+          </w:p>
+        </w:tc>
+        <w:tc>
+          <w:tcPr>
+            <w:tcW w:type="dxa" w:w="1984"/>
+          </w:tcPr>
+          <w:p>
+            <w:pPr>
+              <w:jc w:val="left"/>
+            </w:pPr>
+            <w:r>
+              <w:rPr>
+                <w:rFonts w:ascii="Times New Roman" w:hAnsi="Times New Roman"/>
+                <w:b w:val="0"/>
+                <w:i w:val="0"/>
+                <w:sz w:val="20"/>
+                <w:u w:val="none"/>
+              </w:rPr>
+              <w:t>Backend Development</w:t>
+            </w:r>
+          </w:p>
+        </w:tc>
+      </w:tr>
+      <w:tr>
+        <w:tc>
+          <w:tcPr>
+            <w:tcW w:type="dxa" w:w="1984"/>
+          </w:tcPr>
+          <w:p>
+            <w:pPr>
+              <w:jc w:val="center"/>
+            </w:pPr>
+            <w:r>
+              <w:rPr>
+                <w:rFonts w:ascii="Times New Roman" w:hAnsi="Times New Roman"/>
+                <w:b w:val="0"/>
+                <w:i w:val="0"/>
+                <w:sz w:val="20"/>
+                <w:u w:val="none"/>
+              </w:rPr>
+              <w:t>5</w:t>
+            </w:r>
+          </w:p>
+        </w:tc>
+        <w:tc>
+          <w:tcPr>
+            <w:tcW w:type="dxa" w:w="1984"/>
+          </w:tcPr>
+          <w:p>
+            <w:pPr>
+              <w:jc w:val="left"/>
+            </w:pPr>
+            <w:r>
+              <w:rPr>
+                <w:rFonts w:ascii="Times New Roman" w:hAnsi="Times New Roman"/>
+                <w:b w:val="0"/>
+                <w:i w:val="0"/>
+                <w:sz w:val="20"/>
+                <w:u w:val="none"/>
+              </w:rPr>
+              <w:t>Syukron Ma'mun</w:t>
+            </w:r>
+          </w:p>
+        </w:tc>
+        <w:tc>
+          <w:tcPr>
+            <w:tcW w:type="dxa" w:w="1984"/>
+          </w:tcPr>
+          <w:p>
+            <w:pPr>
+              <w:jc w:val="left"/>
+            </w:pPr>
+            <w:r>
+              <w:rPr>
+                <w:rFonts w:ascii="Times New Roman" w:hAnsi="Times New Roman"/>
+                <w:b w:val="0"/>
+                <w:i w:val="0"/>
+                <w:sz w:val="20"/>
+                <w:u w:val="none"/>
+              </w:rPr>
+              <w:t>Tenaga Ahli Basis Data</w:t>
+            </w:r>
+          </w:p>
+        </w:tc>
+        <w:tc>
+          <w:tcPr>
+            <w:tcW w:type="dxa" w:w="1984"/>
+          </w:tcPr>
+          <w:p>
+            <w:pPr>
+              <w:jc w:val="left"/>
+            </w:pPr>
+            <w:r>
+              <w:rPr>
+                <w:rFonts w:ascii="Times New Roman" w:hAnsi="Times New Roman"/>
+                <w:b w:val="0"/>
+                <w:i w:val="0"/>
+                <w:sz w:val="20"/>
+                <w:u w:val="none"/>
+              </w:rPr>
+              <w:t>Database &amp; Backend</w:t>
+            </w:r>
+          </w:p>
+        </w:tc>
+      </w:tr>
+      <w:tr>
+        <w:tc>
+          <w:tcPr>
+            <w:tcW w:type="dxa" w:w="1984"/>
+          </w:tcPr>
+          <w:p>
+            <w:pPr>
+              <w:jc w:val="center"/>
+            </w:pPr>
+            <w:r>
+              <w:rPr>
+                <w:rFonts w:ascii="Times New Roman" w:hAnsi="Times New Roman"/>
+                <w:b w:val="0"/>
+                <w:i w:val="0"/>
+                <w:sz w:val="20"/>
+                <w:u w:val="none"/>
+              </w:rPr>
+              <w:t>6</w:t>
+            </w:r>
+          </w:p>
+        </w:tc>
+        <w:tc>
+          <w:tcPr>
+            <w:tcW w:type="dxa" w:w="1984"/>
+          </w:tcPr>
+          <w:p>
+            <w:pPr>
+              <w:jc w:val="left"/>
+            </w:pPr>
+            <w:r>
+              <w:rPr>
+                <w:rFonts w:ascii="Times New Roman" w:hAnsi="Times New Roman"/>
+                <w:b w:val="0"/>
+                <w:i w:val="0"/>
+                <w:sz w:val="20"/>
+                <w:u w:val="none"/>
+              </w:rPr>
+              <w:t>Qurrota Aini Dila</w:t>
+            </w:r>
+          </w:p>
+        </w:tc>
+        <w:tc>
+          <w:tcPr>
+            <w:tcW w:type="dxa" w:w="1984"/>
+          </w:tcPr>
+          <w:p>
+            <w:pPr>
+              <w:jc w:val="left"/>
+            </w:pPr>
+            <w:r>
+              <w:rPr>
+                <w:rFonts w:ascii="Times New Roman" w:hAnsi="Times New Roman"/>
+                <w:b w:val="0"/>
+                <w:i w:val="0"/>
+                <w:sz w:val="20"/>
+                <w:u w:val="none"/>
+              </w:rPr>
+              <w:t>Leader UI/UX Designer</w:t>
+            </w:r>
+          </w:p>
+        </w:tc>
+        <w:tc>
+          <w:tcPr>
+            <w:tcW w:type="dxa" w:w="1984"/>
+          </w:tcPr>
+          <w:p>
+            <w:pPr>
+              <w:jc w:val="left"/>
+            </w:pPr>
+            <w:r>
+              <w:rPr>
+                <w:rFonts w:ascii="Times New Roman" w:hAnsi="Times New Roman"/>
+                <w:b w:val="0"/>
+                <w:i w:val="0"/>
+                <w:sz w:val="20"/>
+                <w:u w:val="none"/>
+              </w:rPr>
+              <w:t>UI/UX Design</w:t>
+            </w:r>
+          </w:p>
+        </w:tc>
+      </w:tr>
+      <w:tr>
+        <w:tc>
+          <w:tcPr>
+            <w:tcW w:type="dxa" w:w="1984"/>
+          </w:tcPr>
+          <w:p>
+            <w:pPr>
+              <w:jc w:val="center"/>
+            </w:pPr>
+            <w:r>
+              <w:rPr>
+                <w:rFonts w:ascii="Times New Roman" w:hAnsi="Times New Roman"/>
+                <w:b w:val="0"/>
+                <w:i w:val="0"/>
+                <w:sz w:val="20"/>
+                <w:u w:val="none"/>
+              </w:rPr>
+              <w:t>7</w:t>
+            </w:r>
+          </w:p>
+        </w:tc>
+        <w:tc>
+          <w:tcPr>
+            <w:tcW w:type="dxa" w:w="1984"/>
+          </w:tcPr>
+          <w:p>
+            <w:pPr>
+              <w:jc w:val="left"/>
+            </w:pPr>
+            <w:r>
+              <w:rPr>
+                <w:rFonts w:ascii="Times New Roman" w:hAnsi="Times New Roman"/>
+                <w:b w:val="0"/>
+                <w:i w:val="0"/>
+                <w:sz w:val="20"/>
+                <w:u w:val="none"/>
+              </w:rPr>
+              <w:t>Muhammad Nur Ashiddiqi</w:t>
+            </w:r>
+          </w:p>
+        </w:tc>
+        <w:tc>
+          <w:tcPr>
+            <w:tcW w:type="dxa" w:w="1984"/>
+          </w:tcPr>
+          <w:p>
+            <w:pPr>
+              <w:jc w:val="left"/>
+            </w:pPr>
+            <w:r>
+              <w:rPr>
+                <w:rFonts w:ascii="Times New Roman" w:hAnsi="Times New Roman"/>
+                <w:b w:val="0"/>
+                <w:i w:val="0"/>
+                <w:sz w:val="20"/>
+                <w:u w:val="none"/>
+              </w:rPr>
+              <w:t>DevOps Engineer</w:t>
+            </w:r>
+          </w:p>
+        </w:tc>
+        <w:tc>
+          <w:tcPr>
+            <w:tcW w:type="dxa" w:w="1984"/>
+          </w:tcPr>
+          <w:p>
+            <w:pPr>
+              <w:jc w:val="left"/>
+            </w:pPr>
+            <w:r>
+              <w:rPr>
+                <w:rFonts w:ascii="Times New Roman" w:hAnsi="Times New Roman"/>
+                <w:b w:val="0"/>
+                <w:i w:val="0"/>
+                <w:sz w:val="20"/>
+                <w:u w:val="none"/>
+              </w:rPr>
+              <w:t>Cloud &amp; Infrastructure</w:t>
+            </w:r>
+          </w:p>
+        </w:tc>
+      </w:tr>
+      <w:tr>
+        <w:tc>
+          <w:tcPr>
+            <w:tcW w:type="dxa" w:w="1984"/>
+          </w:tcPr>
+          <w:p>
+            <w:pPr>
+              <w:jc w:val="center"/>
+            </w:pPr>
+            <w:r>
+              <w:rPr>
+                <w:rFonts w:ascii="Times New Roman" w:hAnsi="Times New Roman"/>
+                <w:b w:val="0"/>
+                <w:i w:val="0"/>
+                <w:sz w:val="20"/>
+                <w:u w:val="none"/>
+              </w:rPr>
+              <w:t>8</w:t>
+            </w:r>
+          </w:p>
+        </w:tc>
+        <w:tc>
+          <w:tcPr>
+            <w:tcW w:type="dxa" w:w="1984"/>
+          </w:tcPr>
+          <w:p>
+            <w:pPr>
+              <w:jc w:val="left"/>
+            </w:pPr>
+            <w:r>
+              <w:rPr>
+                <w:rFonts w:ascii="Times New Roman" w:hAnsi="Times New Roman"/>
+                <w:b w:val="0"/>
+                <w:i w:val="0"/>
+                <w:sz w:val="20"/>
+                <w:u w:val="none"/>
+              </w:rPr>
+              <w:t>Aditya Pangestu</w:t>
+            </w:r>
+          </w:p>
+        </w:tc>
+        <w:tc>
+          <w:tcPr>
+            <w:tcW w:type="dxa" w:w="1984"/>
+          </w:tcPr>
+          <w:p>
+            <w:pPr>
+              <w:jc w:val="left"/>
+            </w:pPr>
+            <w:r>
+              <w:rPr>
+                <w:rFonts w:ascii="Times New Roman" w:hAnsi="Times New Roman"/>
+                <w:b w:val="0"/>
+                <w:i w:val="0"/>
+                <w:sz w:val="20"/>
+                <w:u w:val="none"/>
+              </w:rPr>
+              <w:t>Quality Assurance Engineer</w:t>
+            </w:r>
+          </w:p>
+        </w:tc>
+        <w:tc>
+          <w:tcPr>
+            <w:tcW w:type="dxa" w:w="1984"/>
+          </w:tcPr>
+          <w:p>
+            <w:pPr>
+              <w:jc w:val="left"/>
+            </w:pPr>
+            <w:r>
+              <w:rPr>
+                <w:rFonts w:ascii="Times New Roman" w:hAnsi="Times New Roman"/>
+                <w:b w:val="0"/>
+                <w:i w:val="0"/>
+                <w:sz w:val="20"/>
+                <w:u w:val="none"/>
+              </w:rPr>
+              <w:t>QA &amp; Testing</w:t>
+            </w:r>
+          </w:p>
+        </w:tc>
+      </w:tr>
+      <w:tr>
+        <w:tc>
+          <w:tcPr>
+            <w:tcW w:type="dxa" w:w="1984"/>
+          </w:tcPr>
+          <w:p>
+            <w:pPr>
+              <w:jc w:val="center"/>
+            </w:pPr>
+            <w:r>
+              <w:rPr>
+                <w:rFonts w:ascii="Times New Roman" w:hAnsi="Times New Roman"/>
+                <w:b w:val="0"/>
+                <w:i w:val="0"/>
+                <w:sz w:val="20"/>
+                <w:u w:val="none"/>
+              </w:rPr>
+              <w:t>9</w:t>
+            </w:r>
+          </w:p>
+        </w:tc>
+        <w:tc>
+          <w:tcPr>
+            <w:tcW w:type="dxa" w:w="1984"/>
+          </w:tcPr>
+          <w:p>
+            <w:pPr>
+              <w:jc w:val="left"/>
+            </w:pPr>
+            <w:r>
+              <w:rPr>
+                <w:rFonts w:ascii="Times New Roman" w:hAnsi="Times New Roman"/>
+                <w:b w:val="0"/>
+                <w:i w:val="0"/>
+                <w:sz w:val="20"/>
+                <w:u w:val="none"/>
+              </w:rPr>
+              <w:t>Irene Nadia Vaniarinanta</w:t>
+            </w:r>
+          </w:p>
+        </w:tc>
+        <w:tc>
+          <w:tcPr>
+            <w:tcW w:type="dxa" w:w="1984"/>
+          </w:tcPr>
+          <w:p>
+            <w:pPr>
+              <w:jc w:val="left"/>
+            </w:pPr>
+            <w:r>
+              <w:rPr>
+                <w:rFonts w:ascii="Times New Roman" w:hAnsi="Times New Roman"/>
+                <w:b w:val="0"/>
+                <w:i w:val="0"/>
+                <w:sz w:val="20"/>
+                <w:u w:val="none"/>
+              </w:rPr>
+              <w:t>Human Resources Officer</w:t>
+            </w:r>
+          </w:p>
+        </w:tc>
+        <w:tc>
+          <w:tcPr>
+            <w:tcW w:type="dxa" w:w="1984"/>
+          </w:tcPr>
+          <w:p>
+            <w:pPr>
+              <w:jc w:val="left"/>
+            </w:pPr>
+            <w:r>
+              <w:rPr>
+                <w:rFonts w:ascii="Times New Roman" w:hAnsi="Times New Roman"/>
+                <w:b w:val="0"/>
+                <w:i w:val="0"/>
+                <w:sz w:val="20"/>
+                <w:u w:val="none"/>
+              </w:rPr>
+              <w:t>Human Resources</w:t>
+            </w:r>
+          </w:p>
+        </w:tc>
+      </w:tr>
+      <w:tr>
+        <w:tc>
+          <w:tcPr>
+            <w:tcW w:type="dxa" w:w="1984"/>
+          </w:tcPr>
+          <w:p>
+            <w:pPr>
+              <w:jc w:val="center"/>
+            </w:pPr>
+            <w:r>
+              <w:rPr>
+                <w:rFonts w:ascii="Times New Roman" w:hAnsi="Times New Roman"/>
+                <w:b w:val="0"/>
+                <w:i w:val="0"/>
+                <w:sz w:val="20"/>
+                <w:u w:val="none"/>
+              </w:rPr>
+              <w:t>10</w:t>
+            </w:r>
+          </w:p>
+        </w:tc>
+        <w:tc>
+          <w:tcPr>
+            <w:tcW w:type="dxa" w:w="1984"/>
+          </w:tcPr>
+          <w:p>
+            <w:pPr>
+              <w:jc w:val="left"/>
+            </w:pPr>
+            <w:r>
+              <w:rPr>
+                <w:rFonts w:ascii="Times New Roman" w:hAnsi="Times New Roman"/>
+                <w:b w:val="0"/>
+                <w:i w:val="0"/>
+                <w:sz w:val="20"/>
+                <w:u w:val="none"/>
+              </w:rPr>
+              <w:t>Yulivia Annisa Putri</w:t>
+            </w:r>
+          </w:p>
+        </w:tc>
+        <w:tc>
+          <w:tcPr>
+            <w:tcW w:type="dxa" w:w="1984"/>
+          </w:tcPr>
+          <w:p>
+            <w:pPr>
+              <w:jc w:val="left"/>
+            </w:pPr>
+            <w:r>
+              <w:rPr>
+                <w:rFonts w:ascii="Times New Roman" w:hAnsi="Times New Roman"/>
+                <w:b w:val="0"/>
+                <w:i w:val="0"/>
+                <w:sz w:val="20"/>
+                <w:u w:val="none"/>
+              </w:rPr>
+              <w:t>Business Strategy Manager</w:t>
+            </w:r>
+          </w:p>
+        </w:tc>
+        <w:tc>
+          <w:tcPr>
+            <w:tcW w:type="dxa" w:w="1984"/>
+          </w:tcPr>
+          <w:p>
+            <w:pPr>
+              <w:jc w:val="left"/>
+            </w:pPr>
+            <w:r>
+              <w:rPr>
+                <w:rFonts w:ascii="Times New Roman" w:hAnsi="Times New Roman"/>
+                <w:b w:val="0"/>
+                <w:i w:val="0"/>
+                <w:sz w:val="20"/>
+                <w:u w:val="none"/>
+              </w:rPr>
+              <w:t>Business Development</w:t>
+            </w:r>
+          </w:p>
+        </w:tc>
+      </w:tr>
+    </w:tbl>
     <w:p>
       <w:pPr>
         <w:keepNext/>
@@ -5652,7 +7032,7 @@
           <w:sz w:val="24"/>
           <w:u w:val="none"/>
         </w:rPr>
-        <w:t>Kegiatan umum CV Newus Teknologi berfokus pada penyediaan layanan teknologi informasi dan konsultasi di bidang pengembangan perangkat lunak. Perusahaan secara aktif terlibat dalam pengembangan berbagai jenis sistem informasi, mulai dari sistem akademik, platform e-learning, hingga sistem manajemen sumber daya perusahaan. Adapun kegiatan utama perusahaan meliputi:</w:t>
+        <w:t>Kegiatan umum CV Newus Teknologi berfokus pada penyediaan layanan teknologi informasi komprehensif dari hulu ke hilir, mulai dari konsultasi analisis kebutuhan, perancangan desain sistem, pengembangan kode program, pengujian mutu, hingga pemeliharaan dan deployment infrastruktur cloud. Portofolio layanan utama perusahaan meliputi:</w:t>
       </w:r>
     </w:p>
     <w:p>
@@ -5668,7 +7048,7 @@
           <w:sz w:val="24"/>
           <w:u w:val="none"/>
         </w:rPr>
-        <w:t>1) Pengembangan aplikasi web dan mobile berbasis framework modern (Next.js, Laravel, Flutter) untuk kebutuhan klien institusi pendidikan, instansi pemerintah daerah, dan sektor industri swasta.</w:t>
+        <w:t>1) Website &amp; Web Application Development: Pembangunan aplikasi web interaktif skala korporat dan pemerintahan berbasis framework modern (Next.js, React, Laravel, Node.js). Contoh proyek nyata: SIINTAN Dinas Perkim Lampung Utara dan portal korporat terintegrasi.</w:t>
       </w:r>
     </w:p>
     <w:p>
@@ -5684,7 +7064,7 @@
           <w:sz w:val="24"/>
           <w:u w:val="none"/>
         </w:rPr>
-        <w:t>2) Pembangunan sistem informasi akademik dan Learning Management System untuk institusi pendidikan sebagai bagian dari layanan digitalisasi proses belajar mengajar.</w:t>
+        <w:t>2) Mobile Application Development: Pengembangan aplikasi seluler native dan cross-platform (Flutter, React Native) untuk kebutuhan operasional lapangan, pemantauan kesehatan, dan layanan publik.</w:t>
       </w:r>
     </w:p>
     <w:p>
@@ -5700,7 +7080,7 @@
           <w:sz w:val="24"/>
           <w:u w:val="none"/>
         </w:rPr>
-        <w:t>3) Konsultasi arsitektur sistem, perancangan microservices, serta deployment server berbasis cloud computing (Vercel, Railway, AWS, dan Google Cloud Platform).</w:t>
+        <w:t>3) Learning Management System (LMS) &amp; Smart School Systems: Pembangunan platform pendidikan digital terpadu untuk sekolah dan perguruan tinggi yang mencakup manajemen kelas, e-learning, presensi online, penugasan digital, dan rekapitulasi nilai rapor otomatis.</w:t>
       </w:r>
     </w:p>
     <w:p>
@@ -5716,7 +7096,7 @@
           <w:sz w:val="24"/>
           <w:u w:val="none"/>
         </w:rPr>
-        <w:t>4) Perancangan desain antarmuka aplikasi (UI/UX Design) berstandar human-centered design yang mengutamakan kenyamanan, kemudahan navigasi, dan aksesibilitas bagi pengguna akhir.</w:t>
+        <w:t>4) Custom Enterprise Software &amp; ERP: Pengembangan perangkat lunak kustom sesuai kebutuhan unik alur bisnis klien, meliputi modul inventaris, logistik pergudangan, keuangan, dan manajemen aset.</w:t>
       </w:r>
     </w:p>
     <w:p>
@@ -5732,7 +7112,39 @@
           <w:sz w:val="24"/>
           <w:u w:val="none"/>
         </w:rPr>
-        <w:t>5) Pengembangan Enterprise Resource Planning (ERP) dan Smart School Systems yang terintegrasi untuk mendukung kebutuhan operasional dan manajerial institusi pendidikan.</w:t>
+        <w:t>5) Cloud Infrastructure &amp; DevOps Solutions: Perancangan arsitektur server cloud, deployment otomatis (CI/CD), konfigurasi load balancer, containerization (Docker), dan pemeliharaan server pada platform AWS, Google Cloud, Railway, dan Vercel.</w:t>
+      </w:r>
+    </w:p>
+    <w:p>
+      <w:pPr>
+        <w:spacing w:before="0" w:after="0" w:line="360" w:lineRule="auto"/>
+        <w:jc w:val="both"/>
+      </w:pPr>
+      <w:r>
+        <w:rPr>
+          <w:rFonts w:ascii="Times New Roman" w:hAnsi="Times New Roman"/>
+          <w:b w:val="0"/>
+          <w:i w:val="0"/>
+          <w:sz w:val="24"/>
+          <w:u w:val="none"/>
+        </w:rPr>
+        <w:t>6) UI/UX Design &amp; Human-Centered Research: Layanan riset pengalaman pengguna, perancangan user journey, pembuatan wireframe, design system, dan prototype interaktif berstandar industri.</w:t>
+      </w:r>
+    </w:p>
+    <w:p>
+      <w:pPr>
+        <w:spacing w:before="0" w:after="0" w:line="360" w:lineRule="auto"/>
+        <w:jc w:val="both"/>
+      </w:pPr>
+      <w:r>
+        <w:rPr>
+          <w:rFonts w:ascii="Times New Roman" w:hAnsi="Times New Roman"/>
+          <w:b w:val="0"/>
+          <w:i w:val="0"/>
+          <w:sz w:val="24"/>
+          <w:u w:val="none"/>
+        </w:rPr>
+        <w:t>7) IT Consultant &amp; Digital Transformation Advisory: Konsultasi strategi digital, audit sistem informasi, optimasi basis data, dan pendampingan transformasi digital bagi instansi pemerintah dan perusahaan swasta.</w:t>
       </w:r>
     </w:p>
     <w:p>
@@ -9509,7 +10921,7 @@
           <w:sz w:val="28"/>
           <w:u w:val="none"/>
         </w:rPr>
-        <w:t>NPM 23312087</w:t>
+        <w:t>NPM 23312105</w:t>
       </w:r>
     </w:p>
     <w:p>
@@ -9531,7 +10943,7 @@
           <w:sz w:val="24"/>
           <w:u w:val="none"/>
         </w:rPr>
-        <w:t>3.2 FATHUR RAMANTHA (23312087)</w:t>
+        <w:t>3.2 FATHUR RAMANTHA (23312105)</w:t>
       </w:r>
     </w:p>
     <w:p>
@@ -11361,7 +12773,7 @@
           <w:sz w:val="32"/>
           <w:u w:val="none"/>
         </w:rPr>
-        <w:t>I PUTU PANDU</w:t>
+        <w:t>I PUTU PANDU WIRANATA</w:t>
       </w:r>
     </w:p>
     <w:p>
@@ -11400,7 +12812,7 @@
           <w:sz w:val="24"/>
           <w:u w:val="none"/>
         </w:rPr>
-        <w:t>3.3 I PUTU PANDU (23312088)</w:t>
+        <w:t>3.3 I PUTU PANDU WIRANATA (23312088)</w:t>
       </w:r>
     </w:p>
     <w:p>
@@ -13566,7 +14978,7 @@
           <w:sz w:val="24"/>
           <w:u w:val="none"/>
         </w:rPr>
-        <w:t>1) Pelaksanaan Praktik Kerja Lapangan memberikan pengalaman kerja secara langsung kepada penulis dalam lingkungan industri teknologi informasi, khususnya dalam pengembangan Learning Management System berbasis web menggunakan framework Next.js dan Laravel 11.</w:t>
+        <w:t>1) Pelaksanaan Praktik Kerja Lapangan memberikan pengalaman kerja secara langsung kepada penulis dalam lingkungan industri teknologi informasi profesional di CV Newus Teknologi, khususnya dalam pengembangan Learning Management System berbasis web menggunakan framework Next.js dan Laravel 11.</w:t>
       </w:r>
     </w:p>
     <w:p>
@@ -13698,7 +15110,7 @@
           <w:sz w:val="24"/>
           <w:u w:val="none"/>
         </w:rPr>
-        <w:t>1) Perusahaan dapat terus mempertahankan sistem pembelajaran dan pendampingan yang telah berjalan dengan baik sehingga peserta PKL selanjutnya dapat memahami materi dan tugas yang diberikan secara optimal.</w:t>
+        <w:t>1) Perusahaan dapat terus mempertahankan sistem pembelajaran, mentoring, dan pendampingan yang telah berjalan dengan sangat baik sehingga peserta PKL selanjutnya dapat memahami alur kerja dan standar industri secara optimal.</w:t>
       </w:r>
     </w:p>
     <w:p>
@@ -13715,7 +15127,7 @@
           <w:sz w:val="24"/>
           <w:u w:val="none"/>
         </w:rPr>
-        <w:t>2) Perusahaan dapat menambahkan modul video conference interaktif dan payment gateway otomatis ke dalam platform LMS untuk memperluas fungsionalitas produk dan meningkatkan daya saing di pasar.</w:t>
+        <w:t>2) Perusahaan dapat menambahkan modul video conference interaktif dan payment gateway otomatis ke dalam platform LMS untuk memperluas portofolio produk e-learning dan meningkatkan daya saing pasar.</w:t>
       </w:r>
     </w:p>
     <w:p>
@@ -13890,7 +15302,7 @@
           <w:sz w:val="24"/>
           <w:u w:val="none"/>
         </w:rPr>
-        <w:t>Next.js Team, 2024, Next.js App Router Documentation, Vercel Inc., https://nextjs.org/docs, diakses 15 Agustus 2026.</w:t>
+        <w:t>Newus Technology, 2024, Tim &amp; Profil Perusahaan Newus Technology, https://newus.id/team, diakses 24 Agustus 2026.</w:t>
       </w:r>
     </w:p>
     <w:p>
@@ -13907,7 +15319,7 @@
           <w:sz w:val="24"/>
           <w:u w:val="none"/>
         </w:rPr>
-        <w:t>Pressman, R. S. dan Maxim, B. R., 2020, Software Engineering: A Practitioner's Approach (9th ed.), McGraw-Hill Education, New York.</w:t>
+        <w:t>Next.js Team, 2024, Next.js App Router Documentation, Vercel Inc., https://nextjs.org/docs, diakses 15 Agustus 2026.</w:t>
       </w:r>
     </w:p>
     <w:p>
@@ -13924,7 +15336,7 @@
           <w:sz w:val="24"/>
           <w:u w:val="none"/>
         </w:rPr>
-        <w:t>Rosa, A. S. dan Shalahuddin, M., 2019, Rekayasa Perangkat Lunak Terstruktur dan Berorientasi Objek, Informatika Bandung, Bandung.</w:t>
+        <w:t>Pressman, R. S. dan Maxim, B. R., 2020, Software Engineering: A Practitioner's Approach (9th ed.), McGraw-Hill Education, New York.</w:t>
       </w:r>
     </w:p>
     <w:p>
@@ -13941,7 +15353,7 @@
           <w:sz w:val="24"/>
           <w:u w:val="none"/>
         </w:rPr>
-        <w:t>Schwaber, K. dan Sutherland, J., 2020, The Scrum Guide: The Definitive Guide to Scrum: The Rules of the Game, Scrum.org.</w:t>
+        <w:t>Rosa, A. S. dan Shalahuddin, M., 2019, Rekayasa Perangkat Lunak Terstruktur dan Berorientasi Objek, Informatika Bandung, Bandung.</w:t>
       </w:r>
     </w:p>
     <w:p>
@@ -13958,7 +15370,7 @@
           <w:sz w:val="24"/>
           <w:u w:val="none"/>
         </w:rPr>
-        <w:t>Tailwind Labs, 2024, Tailwind CSS Documentation (Version 3.x), https://tailwindcss.com/docs, diakses 15 Agustus 2026.</w:t>
+        <w:t>Schwaber, K. dan Sutherland, J., 2020, The Scrum Guide: The Definitive Guide to Scrum: The Rules of the Game, Scrum.org.</w:t>
       </w:r>
     </w:p>
     <w:p>
@@ -13975,6 +15387,23 @@
           <w:sz w:val="24"/>
           <w:u w:val="none"/>
         </w:rPr>
+        <w:t>Tailwind Labs, 2024, Tailwind CSS Documentation (Version 3.x), https://tailwindcss.com/docs, diakses 15 Agustus 2026.</w:t>
+      </w:r>
+    </w:p>
+    <w:p>
+      <w:pPr>
+        <w:spacing w:before="0" w:after="120" w:line="240" w:lineRule="auto"/>
+        <w:ind w:hanging="720" w:left="720"/>
+        <w:jc w:val="both"/>
+      </w:pPr>
+      <w:r>
+        <w:rPr>
+          <w:rFonts w:ascii="Times New Roman" w:hAnsi="Times New Roman"/>
+          <w:b w:val="0"/>
+          <w:i w:val="0"/>
+          <w:sz w:val="24"/>
+          <w:u w:val="none"/>
+        </w:rPr>
         <w:t>Turban, E., et al., 2005, Decision Support System and Intelligent System, Edisi 7 jilid 1, Pearson Education Inc., Upper Saddle River, New Jersey dan Penerbit Andi, Yogyakarta.</w:t>
       </w:r>
     </w:p>
@@ -14161,7 +15590,7 @@
           <w:sz w:val="24"/>
           <w:u w:val="none"/>
         </w:rPr>
-        <w:t>Lampiran 5  Formulir Penilaian I Putu Pandu</w:t>
+        <w:t>Lampiran 5  Formulir Penilaian I Putu Pandu Wiranata</w:t>
       </w:r>
     </w:p>
     <w:p>
@@ -14177,7 +15606,7 @@
           <w:sz w:val="22"/>
           <w:u w:val="none"/>
         </w:rPr>
-        <w:t>[Gambar untuk Formulir Penilaian Mahasiswa PKL - I Putu Pandu]</w:t>
+        <w:t>[Gambar untuk Formulir Penilaian Mahasiswa PKL - I Putu Pandu Wiranata]</w:t>
       </w:r>
     </w:p>
     <w:p>
@@ -14198,7 +15627,7 @@
           <w:sz w:val="24"/>
           <w:u w:val="none"/>
         </w:rPr>
-        <w:t>Lampiran 6  Catatan Harian I Putu Pandu</w:t>
+        <w:t>Lampiran 6  Catatan Harian I Putu Pandu Wiranata</w:t>
       </w:r>
     </w:p>
     <w:p>
@@ -14214,7 +15643,7 @@
           <w:sz w:val="22"/>
           <w:u w:val="none"/>
         </w:rPr>
-        <w:t>[Gambar untuk Catatan Harian PKL - I Putu Pandu]</w:t>
+        <w:t>[Gambar untuk Catatan Harian PKL - I Putu Pandu Wiranata]</w:t>
       </w:r>
     </w:p>
     <w:p>

</xml_diff>